<commit_message>
Lab-2 network report started
</commit_message>
<xml_diff>
--- a/network/lab-2/ПРИ123-ИС-#02-Нямаа.docx
+++ b/network/lab-2/ПРИ123-ИС-#02-Нямаа.docx
@@ -672,91 +672,84 @@
           <w:sz w:val="44"/>
           <w:szCs w:val="44"/>
         </w:rPr>
-        <w:t>Лабораторная работа №</w:t>
-      </w:r>
-      <w:r>
+        <w:t>Лабораторная работа №2</w:t>
+      </w:r>
+    </w:p>
+    <w:p>
+      <w:pPr>
+        <w:pStyle w:val="Normal"/>
+        <w:jc w:val="center"/>
         <w:rPr>
           <w:sz w:val="44"/>
           <w:szCs w:val="44"/>
         </w:rPr>
-        <w:t>2</w:t>
-      </w:r>
-    </w:p>
-    <w:p>
-      <w:pPr>
-        <w:pStyle w:val="Normal"/>
-        <w:jc w:val="center"/>
+      </w:pPr>
+      <w:r>
         <w:rPr>
           <w:sz w:val="44"/>
           <w:szCs w:val="44"/>
         </w:rPr>
-      </w:pPr>
+        <w:t>по дисциплине «Информационные сети»</w:t>
+      </w:r>
+    </w:p>
+    <w:p>
+      <w:pPr>
+        <w:pStyle w:val="Normal"/>
+        <w:rPr>
+          <w:sz w:val="44"/>
+          <w:szCs w:val="28"/>
+        </w:rPr>
+      </w:pPr>
+      <w:r>
+        <w:rPr>
+          <w:sz w:val="44"/>
+          <w:szCs w:val="28"/>
+        </w:rPr>
+      </w:r>
+    </w:p>
+    <w:p>
+      <w:pPr>
+        <w:pStyle w:val="Normal"/>
+        <w:rPr>
+          <w:sz w:val="28"/>
+          <w:szCs w:val="28"/>
+        </w:rPr>
+      </w:pPr>
+      <w:r>
+        <w:rPr>
+          <w:sz w:val="28"/>
+          <w:szCs w:val="28"/>
+        </w:rPr>
+      </w:r>
+    </w:p>
+    <w:p>
+      <w:pPr>
+        <w:pStyle w:val="Normal"/>
+        <w:jc w:val="center"/>
+        <w:rPr>
+          <w:sz w:val="36"/>
+          <w:szCs w:val="28"/>
+        </w:rPr>
+      </w:pPr>
+      <w:r>
+        <w:rPr>
+          <w:sz w:val="44"/>
+          <w:szCs w:val="28"/>
+        </w:rPr>
+        <w:t>Тема: «</w:t>
+      </w:r>
       <w:r>
         <w:rPr>
           <w:sz w:val="44"/>
           <w:szCs w:val="44"/>
         </w:rPr>
-        <w:t>по дисциплине «Информационные сети»</w:t>
-      </w:r>
-    </w:p>
-    <w:p>
-      <w:pPr>
-        <w:pStyle w:val="Normal"/>
+        <w:t>Установка и настройка одноранговой сети. Изучение основных сетевых утилит.</w:t>
+      </w:r>
+      <w:r>
         <w:rPr>
           <w:sz w:val="44"/>
           <w:szCs w:val="28"/>
         </w:rPr>
-      </w:pPr>
-      <w:r>
-        <w:rPr>
-          <w:sz w:val="44"/>
-          <w:szCs w:val="28"/>
-        </w:rPr>
-      </w:r>
-    </w:p>
-    <w:p>
-      <w:pPr>
-        <w:pStyle w:val="Normal"/>
-        <w:rPr>
-          <w:sz w:val="28"/>
-          <w:szCs w:val="28"/>
-        </w:rPr>
-      </w:pPr>
-      <w:r>
-        <w:rPr>
-          <w:sz w:val="28"/>
-          <w:szCs w:val="28"/>
-        </w:rPr>
-      </w:r>
-    </w:p>
-    <w:p>
-      <w:pPr>
-        <w:pStyle w:val="Normal"/>
-        <w:jc w:val="center"/>
-        <w:rPr>
-          <w:sz w:val="36"/>
-          <w:szCs w:val="28"/>
-        </w:rPr>
-      </w:pPr>
-      <w:r>
-        <w:rPr>
-          <w:sz w:val="44"/>
-          <w:szCs w:val="28"/>
-        </w:rPr>
-        <w:t>Тема: «</w:t>
-      </w:r>
-      <w:r>
-        <w:rPr>
-          <w:sz w:val="44"/>
-          <w:szCs w:val="44"/>
-        </w:rPr>
-        <w:t>Базовая настройка сетевых средств ОС</w:t>
-      </w:r>
-      <w:r>
-        <w:rPr>
-          <w:sz w:val="44"/>
-          <w:szCs w:val="28"/>
-        </w:rPr>
         <w:t>»</w:t>
       </w:r>
     </w:p>
@@ -780,21 +773,6 @@
       <w:pPr>
         <w:pStyle w:val="Normal"/>
         <w:jc w:val="right"/>
-        <w:rPr>
-          <w:sz w:val="28"/>
-          <w:szCs w:val="28"/>
-        </w:rPr>
-      </w:pPr>
-      <w:r>
-        <w:rPr>
-          <w:sz w:val="28"/>
-          <w:szCs w:val="28"/>
-        </w:rPr>
-      </w:r>
-    </w:p>
-    <w:p>
-      <w:pPr>
-        <w:pStyle w:val="Normal"/>
         <w:rPr>
           <w:sz w:val="28"/>
           <w:szCs w:val="28"/>
@@ -1133,7 +1111,7 @@
         <w:rPr>
           <w:sz w:val="28"/>
         </w:rPr>
-        <w:t>Получить навыки базовой настройки сетевых средств операционных систем.</w:t>
+        <w:t>Выяснить назначение виртуальных машин. Научиться использовать их для работы с ОС. Узнать базовые принципы IP-адрессации. Научиться настраивать стек протоколов TCP/IP и уметь организовывать одноранговую сеть. Ознакомиться и уметь использовать основные консольные утилиты для получения информации о сетевой конфигурации системы и тестирования работоспособности сети.</w:t>
       </w:r>
     </w:p>
     <w:p>
@@ -1310,10 +1288,7 @@
         </w:rPr>
       </w:pPr>
       <w:r>
-        <w:rPr>
-          <w:sz w:val="28"/>
-          <w:szCs w:val="28"/>
-        </w:rPr>
+        <w:rPr/>
         <w:drawing>
           <wp:inline distT="0" distB="0" distL="0" distR="0">
             <wp:extent cx="5940425" cy="3573145"/>
@@ -1368,28 +1343,7 @@
           <w:sz w:val="28"/>
           <w:szCs w:val="28"/>
         </w:rPr>
-        <w:t xml:space="preserve">Рисунок </w:t>
-      </w:r>
-      <w:r>
-        <w:rPr>
-          <w:sz w:val="28"/>
-          <w:szCs w:val="28"/>
-        </w:rPr>
-        <w:t>2</w:t>
-      </w:r>
-      <w:r>
-        <w:rPr>
-          <w:sz w:val="28"/>
-          <w:szCs w:val="28"/>
-        </w:rPr>
-        <w:t>. Установленный адаптер сети «</w:t>
-      </w:r>
-      <w:r>
-        <w:rPr>
-          <w:sz w:val="28"/>
-          <w:szCs w:val="28"/>
-        </w:rPr>
-        <w:t>Internal Network».</w:t>
+        <w:t>Рисунок 2. Установленный адаптер сети «Internal Network».</w:t>
       </w:r>
     </w:p>
     <w:p>
@@ -1403,24 +1357,24 @@
         </w:rPr>
       </w:pPr>
       <w:r>
+        <w:rPr>
+          <w:sz w:val="28"/>
+          <w:szCs w:val="28"/>
+        </w:rPr>
+      </w:r>
+    </w:p>
+    <w:p>
+      <w:pPr>
+        <w:pStyle w:val="Normal"/>
+        <w:spacing w:lineRule="auto" w:line="360"/>
+        <w:jc w:val="center"/>
+        <w:rPr>
+          <w:sz w:val="28"/>
+          <w:szCs w:val="28"/>
+        </w:rPr>
+      </w:pPr>
+      <w:r>
         <w:rPr/>
-      </w:r>
-    </w:p>
-    <w:p>
-      <w:pPr>
-        <w:pStyle w:val="Normal"/>
-        <w:spacing w:lineRule="auto" w:line="360"/>
-        <w:jc w:val="center"/>
-        <w:rPr>
-          <w:sz w:val="28"/>
-          <w:szCs w:val="28"/>
-        </w:rPr>
-      </w:pPr>
-      <w:r>
-        <w:rPr>
-          <w:sz w:val="28"/>
-          <w:szCs w:val="28"/>
-        </w:rPr>
         <w:drawing>
           <wp:inline distT="0" distB="0" distL="0" distR="0">
             <wp:extent cx="5940425" cy="3573145"/>
@@ -1464,35 +1418,7 @@
           <w:sz w:val="28"/>
           <w:szCs w:val="28"/>
         </w:rPr>
-        <w:t>Р</w:t>
-      </w:r>
-      <w:r>
-        <w:rPr>
-          <w:sz w:val="28"/>
-          <w:szCs w:val="28"/>
-        </w:rPr>
-        <w:t xml:space="preserve">исунок </w:t>
-      </w:r>
-      <w:r>
-        <w:rPr>
-          <w:sz w:val="28"/>
-          <w:szCs w:val="28"/>
-        </w:rPr>
-        <w:t>3</w:t>
-      </w:r>
-      <w:r>
-        <w:rPr>
-          <w:sz w:val="28"/>
-          <w:szCs w:val="28"/>
-        </w:rPr>
-        <w:t>. Установленный адаптер сети «</w:t>
-      </w:r>
-      <w:r>
-        <w:rPr>
-          <w:sz w:val="28"/>
-          <w:szCs w:val="28"/>
-        </w:rPr>
-        <w:t>Nat».</w:t>
+        <w:t>Рисунок 3. Установленный адаптер сети «Nat».</w:t>
       </w:r>
     </w:p>
     <w:p>
@@ -1506,10 +1432,7 @@
         </w:rPr>
       </w:pPr>
       <w:r>
-        <w:rPr>
-          <w:sz w:val="28"/>
-          <w:szCs w:val="28"/>
-        </w:rPr>
+        <w:rPr/>
         <w:drawing>
           <wp:inline distT="0" distB="0" distL="0" distR="0">
             <wp:extent cx="5940425" cy="4102100"/>
@@ -1578,10 +1501,21 @@
         </w:rPr>
       </w:pPr>
       <w:r>
-        <w:rPr>
-          <w:sz w:val="28"/>
-          <w:szCs w:val="28"/>
-        </w:rPr>
+        <w:rPr/>
+      </w:r>
+    </w:p>
+    <w:p>
+      <w:pPr>
+        <w:pStyle w:val="Normal"/>
+        <w:spacing w:lineRule="auto" w:line="360"/>
+        <w:jc w:val="center"/>
+        <w:rPr>
+          <w:sz w:val="28"/>
+          <w:szCs w:val="28"/>
+        </w:rPr>
+      </w:pPr>
+      <w:r>
+        <w:rPr/>
         <w:drawing>
           <wp:inline distT="0" distB="0" distL="0" distR="0">
             <wp:extent cx="5940425" cy="4102100"/>
@@ -1636,35 +1570,7 @@
           <w:sz w:val="28"/>
           <w:szCs w:val="28"/>
         </w:rPr>
-        <w:t>Р</w:t>
-      </w:r>
-      <w:r>
-        <w:rPr>
-          <w:sz w:val="28"/>
-          <w:szCs w:val="28"/>
-        </w:rPr>
-        <w:t xml:space="preserve">исунок </w:t>
-      </w:r>
-      <w:r>
-        <w:rPr>
-          <w:sz w:val="28"/>
-          <w:szCs w:val="28"/>
-        </w:rPr>
-        <w:t>5</w:t>
-      </w:r>
-      <w:r>
-        <w:rPr>
-          <w:sz w:val="28"/>
-          <w:szCs w:val="28"/>
-        </w:rPr>
-        <w:t xml:space="preserve">. </w:t>
-      </w:r>
-      <w:r>
-        <w:rPr>
-          <w:sz w:val="28"/>
-          <w:szCs w:val="28"/>
-        </w:rPr>
-        <w:t>Сетевые интерфейсы на виртуальной машине.</w:t>
+        <w:t>Рисунок 5. Сетевые интерфейсы на виртуальной машине.</w:t>
       </w:r>
     </w:p>
     <w:p>
@@ -1678,24 +1584,24 @@
         </w:rPr>
       </w:pPr>
       <w:r>
+        <w:rPr>
+          <w:sz w:val="28"/>
+          <w:szCs w:val="28"/>
+        </w:rPr>
+      </w:r>
+    </w:p>
+    <w:p>
+      <w:pPr>
+        <w:pStyle w:val="Normal"/>
+        <w:spacing w:lineRule="auto" w:line="360"/>
+        <w:jc w:val="center"/>
+        <w:rPr>
+          <w:sz w:val="28"/>
+          <w:szCs w:val="28"/>
+        </w:rPr>
+      </w:pPr>
+      <w:r>
         <w:rPr/>
-      </w:r>
-    </w:p>
-    <w:p>
-      <w:pPr>
-        <w:pStyle w:val="Normal"/>
-        <w:spacing w:lineRule="auto" w:line="360"/>
-        <w:jc w:val="center"/>
-        <w:rPr>
-          <w:sz w:val="28"/>
-          <w:szCs w:val="28"/>
-        </w:rPr>
-      </w:pPr>
-      <w:r>
-        <w:rPr>
-          <w:sz w:val="28"/>
-          <w:szCs w:val="28"/>
-        </w:rPr>
         <w:drawing>
           <wp:inline distT="0" distB="0" distL="0" distR="0">
             <wp:extent cx="5940425" cy="4102100"/>
@@ -1750,35 +1656,7 @@
           <w:sz w:val="28"/>
           <w:szCs w:val="28"/>
         </w:rPr>
-        <w:t>Р</w:t>
-      </w:r>
-      <w:r>
-        <w:rPr>
-          <w:sz w:val="28"/>
-          <w:szCs w:val="28"/>
-        </w:rPr>
-        <w:t xml:space="preserve">исунок </w:t>
-      </w:r>
-      <w:r>
-        <w:rPr>
-          <w:sz w:val="28"/>
-          <w:szCs w:val="28"/>
-        </w:rPr>
-        <w:t>6</w:t>
-      </w:r>
-      <w:r>
-        <w:rPr>
-          <w:sz w:val="28"/>
-          <w:szCs w:val="28"/>
-        </w:rPr>
-        <w:t xml:space="preserve">. </w:t>
-      </w:r>
-      <w:r>
-        <w:rPr>
-          <w:sz w:val="28"/>
-          <w:szCs w:val="28"/>
-        </w:rPr>
-        <w:t>Проверка доступа виртуальной машины во внутренней сети.</w:t>
+        <w:t>Рисунок 6. Проверка доступа виртуальной машины во внутренней сети.</w:t>
       </w:r>
     </w:p>
     <w:p>
@@ -1792,7 +1670,10 @@
         </w:rPr>
       </w:pPr>
       <w:r>
-        <w:rPr/>
+        <w:rPr>
+          <w:sz w:val="28"/>
+          <w:szCs w:val="28"/>
+        </w:rPr>
       </w:r>
     </w:p>
     <w:p>
@@ -1806,7 +1687,82 @@
         </w:rPr>
       </w:pPr>
       <w:r>
-        <w:rPr/>
+        <w:rPr>
+          <w:sz w:val="28"/>
+          <w:szCs w:val="28"/>
+        </w:rPr>
+        <w:drawing>
+          <wp:inline distT="0" distB="0" distL="0" distR="0">
+            <wp:extent cx="5582285" cy="1678305"/>
+            <wp:effectExtent l="0" t="0" r="0" b="0"/>
+            <wp:docPr id="7" name="Image7" descr=""/>
+            <wp:cNvGraphicFramePr>
+              <a:graphicFrameLocks xmlns:a="http://schemas.openxmlformats.org/drawingml/2006/main" noChangeAspect="1"/>
+            </wp:cNvGraphicFramePr>
+            <a:graphic xmlns:a="http://schemas.openxmlformats.org/drawingml/2006/main">
+              <a:graphicData uri="http://schemas.openxmlformats.org/drawingml/2006/picture">
+                <pic:pic xmlns:pic="http://schemas.openxmlformats.org/drawingml/2006/picture">
+                  <pic:nvPicPr>
+                    <pic:cNvPr id="7" name="Image7" descr=""/>
+                    <pic:cNvPicPr>
+                      <a:picLocks noChangeAspect="1" noChangeArrowheads="1"/>
+                    </pic:cNvPicPr>
+                  </pic:nvPicPr>
+                  <pic:blipFill>
+                    <a:blip r:embed="rId8"/>
+                    <a:stretch>
+                      <a:fillRect/>
+                    </a:stretch>
+                  </pic:blipFill>
+                  <pic:spPr bwMode="auto">
+                    <a:xfrm>
+                      <a:off x="0" y="0"/>
+                      <a:ext cx="5582285" cy="1678305"/>
+                    </a:xfrm>
+                    <a:prstGeom prst="rect">
+                      <a:avLst/>
+                    </a:prstGeom>
+                  </pic:spPr>
+                </pic:pic>
+              </a:graphicData>
+            </a:graphic>
+          </wp:inline>
+        </w:drawing>
+      </w:r>
+    </w:p>
+    <w:p>
+      <w:pPr>
+        <w:pStyle w:val="Normal"/>
+        <w:spacing w:lineRule="auto" w:line="360"/>
+        <w:jc w:val="center"/>
+        <w:rPr>
+          <w:sz w:val="28"/>
+          <w:szCs w:val="28"/>
+        </w:rPr>
+      </w:pPr>
+      <w:r>
+        <w:rPr>
+          <w:sz w:val="28"/>
+          <w:szCs w:val="28"/>
+        </w:rPr>
+        <w:t>Рисунок 7. Проверка доступа вирутальной машины во внешнюю сеть.</w:t>
+      </w:r>
+    </w:p>
+    <w:p>
+      <w:pPr>
+        <w:pStyle w:val="Normal"/>
+        <w:spacing w:lineRule="auto" w:line="360"/>
+        <w:jc w:val="center"/>
+        <w:rPr>
+          <w:sz w:val="28"/>
+          <w:szCs w:val="28"/>
+        </w:rPr>
+      </w:pPr>
+      <w:r>
+        <w:rPr>
+          <w:sz w:val="28"/>
+          <w:szCs w:val="28"/>
+        </w:rPr>
       </w:r>
     </w:p>
     <w:p>
@@ -1841,13 +1797,13 @@
         <w:rPr>
           <w:sz w:val="28"/>
         </w:rPr>
-        <w:t>Я получил навыки базовой настройки сетевых средств операционных систем.</w:t>
+        <w:t>Я выяснил назначение виртуальных машин. Научился использовать их для работы с ОС. Узнал базовые принципы IP-адрессации. Научился настраивать стек протоколов TCP/IP и организовывать одноранговую сеть. Ознакомился и научился использовать основные консольные утилиты для получения информации о сетевой конфигурации системы и тестирования работоспособности сети.</w:t>
       </w:r>
     </w:p>
     <w:sectPr>
-      <w:footerReference w:type="even" r:id="rId8"/>
-      <w:footerReference w:type="default" r:id="rId9"/>
-      <w:footerReference w:type="first" r:id="rId10"/>
+      <w:footerReference w:type="even" r:id="rId9"/>
+      <w:footerReference w:type="default" r:id="rId10"/>
+      <w:footerReference w:type="first" r:id="rId11"/>
       <w:type w:val="nextPage"/>
       <w:pgSz w:w="11906" w:h="16838"/>
       <w:pgMar w:left="1701" w:right="850" w:gutter="0" w:header="0" w:top="1134" w:footer="708" w:bottom="1134"/>
@@ -1906,7 +1862,7 @@
         </w:r>
         <w:r>
           <w:rPr/>
-          <w:t>3</w:t>
+          <w:t>4</w:t>
         </w:r>
         <w:r>
           <w:rPr/>
@@ -2353,7 +2309,7 @@
       <w:kern w:val="0"/>
       <w:sz w:val="22"/>
       <w:szCs w:val="20"/>
-      <w:lang w:eastAsia="ru-RU" w:val="ru-RU" w:bidi="ar-SA"/>
+      <w:lang w:val="ru-RU" w:eastAsia="ru-RU" w:bidi="ar-SA"/>
     </w:rPr>
   </w:style>
   <w:style w:type="character" w:styleId="DefaultParagraphFont" w:default="1">

</xml_diff>

<commit_message>
Hope lab-2 network done
</commit_message>
<xml_diff>
--- a/network/lab-2/ПРИ123-ИС-#02-Нямаа.docx
+++ b/network/lab-2/ПРИ123-ИС-#02-Нямаа.docx
@@ -1,10 +1,9 @@
 
 <file path=word/document.xml><?xml version="1.0" encoding="utf-8"?>
-<w:document xmlns:o="urn:schemas-microsoft-com:office:office" xmlns:r="http://schemas.openxmlformats.org/officeDocument/2006/relationships" xmlns:v="urn:schemas-microsoft-com:vml" xmlns:w="http://schemas.openxmlformats.org/wordprocessingml/2006/main" xmlns:w10="urn:schemas-microsoft-com:office:word" xmlns:wp="http://schemas.openxmlformats.org/drawingml/2006/wordprocessingDrawing" xmlns:wps="http://schemas.microsoft.com/office/word/2010/wordprocessingShape" xmlns:wpg="http://schemas.microsoft.com/office/word/2010/wordprocessingGroup" xmlns:mc="http://schemas.openxmlformats.org/markup-compatibility/2006" xmlns:wp14="http://schemas.microsoft.com/office/word/2010/wordprocessingDrawing" xmlns:w14="http://schemas.microsoft.com/office/word/2010/wordml" xmlns:w15="http://schemas.microsoft.com/office/word/2012/wordml" mc:Ignorable="w14 wp14 w15">
+<w:document xmlns:wpc="http://schemas.microsoft.com/office/word/2010/wordprocessingCanvas" xmlns:cx="http://schemas.microsoft.com/office/drawing/2014/chartex" xmlns:cx1="http://schemas.microsoft.com/office/drawing/2015/9/8/chartex" xmlns:cx2="http://schemas.microsoft.com/office/drawing/2015/10/21/chartex" xmlns:cx3="http://schemas.microsoft.com/office/drawing/2016/5/9/chartex" xmlns:cx4="http://schemas.microsoft.com/office/drawing/2016/5/10/chartex" xmlns:cx5="http://schemas.microsoft.com/office/drawing/2016/5/11/chartex" xmlns:cx6="http://schemas.microsoft.com/office/drawing/2016/5/12/chartex" xmlns:cx7="http://schemas.microsoft.com/office/drawing/2016/5/13/chartex" xmlns:cx8="http://schemas.microsoft.com/office/drawing/2016/5/14/chartex" xmlns:mc="http://schemas.openxmlformats.org/markup-compatibility/2006" xmlns:aink="http://schemas.microsoft.com/office/drawing/2016/ink" xmlns:am3d="http://schemas.microsoft.com/office/drawing/2017/model3d" xmlns:o="urn:schemas-microsoft-com:office:office" xmlns:oel="http://schemas.microsoft.com/office/2019/extlst" xmlns:r="http://schemas.openxmlformats.org/officeDocument/2006/relationships" xmlns:m="http://schemas.openxmlformats.org/officeDocument/2006/math" xmlns:v="urn:schemas-microsoft-com:vml" xmlns:wp14="http://schemas.microsoft.com/office/word/2010/wordprocessingDrawing" xmlns:wp="http://schemas.openxmlformats.org/drawingml/2006/wordprocessingDrawing" xmlns:w10="urn:schemas-microsoft-com:office:word" xmlns:w="http://schemas.openxmlformats.org/wordprocessingml/2006/main" xmlns:w14="http://schemas.microsoft.com/office/word/2010/wordml" xmlns:w15="http://schemas.microsoft.com/office/word/2012/wordml" xmlns:w16cex="http://schemas.microsoft.com/office/word/2018/wordml/cex" xmlns:w16cid="http://schemas.microsoft.com/office/word/2016/wordml/cid" xmlns:w16="http://schemas.microsoft.com/office/word/2018/wordml" xmlns:w16sdtdh="http://schemas.microsoft.com/office/word/2020/wordml/sdtdatahash" xmlns:w16se="http://schemas.microsoft.com/office/word/2015/wordml/symex" xmlns:wpg="http://schemas.microsoft.com/office/word/2010/wordprocessingGroup" xmlns:wpi="http://schemas.microsoft.com/office/word/2010/wordprocessingInk" xmlns:wne="http://schemas.microsoft.com/office/word/2006/wordml" xmlns:wps="http://schemas.microsoft.com/office/word/2010/wordprocessingShape" mc:Ignorable="w14 w15 w16se w16cid w16 w16cex w16sdtdh wp14">
   <w:body>
     <w:p>
       <w:pPr>
-        <w:pStyle w:val="Normal"/>
         <w:ind w:right="-1"/>
         <w:jc w:val="center"/>
         <w:rPr>
@@ -68,7 +67,6 @@
     </w:p>
     <w:p>
       <w:pPr>
-        <w:pStyle w:val="Normal"/>
         <w:ind w:right="-1"/>
         <w:jc w:val="center"/>
         <w:rPr>
@@ -190,7 +188,6 @@
     </w:p>
     <w:p>
       <w:pPr>
-        <w:pStyle w:val="Normal"/>
         <w:ind w:right="-1"/>
         <w:jc w:val="center"/>
         <w:rPr>
@@ -238,7 +235,6 @@
     </w:p>
     <w:p>
       <w:pPr>
-        <w:pStyle w:val="Normal"/>
         <w:ind w:right="-1"/>
         <w:jc w:val="center"/>
         <w:rPr>
@@ -347,7 +343,6 @@
     </w:p>
     <w:p>
       <w:pPr>
-        <w:pStyle w:val="Normal"/>
         <w:ind w:right="-1"/>
         <w:jc w:val="center"/>
         <w:rPr>
@@ -361,12 +356,29 @@
           <w:sz w:val="24"/>
           <w:szCs w:val="24"/>
         </w:rPr>
-        <w:t>(ВлГУ)</w:t>
-      </w:r>
-    </w:p>
-    <w:p>
-      <w:pPr>
-        <w:pStyle w:val="Normal"/>
+        <w:t>(</w:t>
+      </w:r>
+      <w:proofErr w:type="spellStart"/>
+      <w:r>
+        <w:rPr>
+          <w:b/>
+          <w:sz w:val="24"/>
+          <w:szCs w:val="24"/>
+        </w:rPr>
+        <w:t>ВлГУ</w:t>
+      </w:r>
+      <w:proofErr w:type="spellEnd"/>
+      <w:r>
+        <w:rPr>
+          <w:b/>
+          <w:sz w:val="24"/>
+          <w:szCs w:val="24"/>
+        </w:rPr>
+        <w:t>)</w:t>
+      </w:r>
+    </w:p>
+    <w:p>
+      <w:pPr>
         <w:ind w:right="-1"/>
         <w:jc w:val="center"/>
         <w:rPr>
@@ -375,17 +387,9 @@
           <w:szCs w:val="24"/>
         </w:rPr>
       </w:pPr>
-      <w:r>
-        <w:rPr>
-          <w:b/>
-          <w:sz w:val="24"/>
-          <w:szCs w:val="24"/>
-        </w:rPr>
-      </w:r>
-    </w:p>
-    <w:p>
-      <w:pPr>
-        <w:pStyle w:val="Normal"/>
+    </w:p>
+    <w:p>
+      <w:pPr>
         <w:ind w:right="-1"/>
         <w:jc w:val="center"/>
         <w:rPr>
@@ -490,177 +494,106 @@
     </w:p>
     <w:p>
       <w:pPr>
-        <w:pStyle w:val="PlainText"/>
+        <w:pStyle w:val="a4"/>
         <w:rPr>
           <w:rFonts w:ascii="Times New Roman" w:hAnsi="Times New Roman"/>
           <w:sz w:val="28"/>
           <w:szCs w:val="28"/>
         </w:rPr>
       </w:pPr>
-      <w:r>
+    </w:p>
+    <w:p>
+      <w:pPr>
+        <w:pStyle w:val="a4"/>
         <w:rPr>
           <w:rFonts w:ascii="Times New Roman" w:hAnsi="Times New Roman"/>
           <w:sz w:val="28"/>
           <w:szCs w:val="28"/>
         </w:rPr>
-      </w:r>
-    </w:p>
-    <w:p>
-      <w:pPr>
-        <w:pStyle w:val="PlainText"/>
+      </w:pPr>
+    </w:p>
+    <w:p>
+      <w:pPr>
+        <w:pStyle w:val="a4"/>
         <w:rPr>
           <w:rFonts w:ascii="Times New Roman" w:hAnsi="Times New Roman"/>
           <w:sz w:val="28"/>
           <w:szCs w:val="28"/>
         </w:rPr>
       </w:pPr>
-      <w:r>
+    </w:p>
+    <w:p>
+      <w:pPr>
+        <w:pStyle w:val="a4"/>
         <w:rPr>
           <w:rFonts w:ascii="Times New Roman" w:hAnsi="Times New Roman"/>
           <w:sz w:val="28"/>
           <w:szCs w:val="28"/>
         </w:rPr>
-      </w:r>
-    </w:p>
-    <w:p>
-      <w:pPr>
-        <w:pStyle w:val="PlainText"/>
+      </w:pPr>
+    </w:p>
+    <w:p>
+      <w:pPr>
+        <w:pStyle w:val="a4"/>
         <w:rPr>
           <w:rFonts w:ascii="Times New Roman" w:hAnsi="Times New Roman"/>
           <w:sz w:val="28"/>
           <w:szCs w:val="28"/>
         </w:rPr>
       </w:pPr>
-      <w:r>
+    </w:p>
+    <w:p>
+      <w:pPr>
+        <w:pStyle w:val="a4"/>
         <w:rPr>
           <w:rFonts w:ascii="Times New Roman" w:hAnsi="Times New Roman"/>
           <w:sz w:val="28"/>
           <w:szCs w:val="28"/>
         </w:rPr>
-      </w:r>
-    </w:p>
-    <w:p>
-      <w:pPr>
-        <w:pStyle w:val="PlainText"/>
+      </w:pPr>
+    </w:p>
+    <w:p>
+      <w:pPr>
+        <w:pStyle w:val="a4"/>
         <w:rPr>
           <w:rFonts w:ascii="Times New Roman" w:hAnsi="Times New Roman"/>
           <w:sz w:val="28"/>
           <w:szCs w:val="28"/>
         </w:rPr>
       </w:pPr>
-      <w:r>
+    </w:p>
+    <w:p>
+      <w:pPr>
+        <w:pStyle w:val="a4"/>
         <w:rPr>
           <w:rFonts w:ascii="Times New Roman" w:hAnsi="Times New Roman"/>
           <w:sz w:val="28"/>
           <w:szCs w:val="28"/>
         </w:rPr>
-      </w:r>
-    </w:p>
-    <w:p>
-      <w:pPr>
-        <w:pStyle w:val="PlainText"/>
+      </w:pPr>
+    </w:p>
+    <w:p>
+      <w:pPr>
+        <w:pStyle w:val="a4"/>
         <w:rPr>
           <w:rFonts w:ascii="Times New Roman" w:hAnsi="Times New Roman"/>
           <w:sz w:val="28"/>
           <w:szCs w:val="28"/>
         </w:rPr>
       </w:pPr>
-      <w:r>
+    </w:p>
+    <w:p>
+      <w:pPr>
+        <w:pStyle w:val="a4"/>
         <w:rPr>
           <w:rFonts w:ascii="Times New Roman" w:hAnsi="Times New Roman"/>
           <w:sz w:val="28"/>
           <w:szCs w:val="28"/>
         </w:rPr>
-      </w:r>
-    </w:p>
-    <w:p>
-      <w:pPr>
-        <w:pStyle w:val="PlainText"/>
-        <w:rPr>
-          <w:rFonts w:ascii="Times New Roman" w:hAnsi="Times New Roman"/>
-          <w:sz w:val="28"/>
-          <w:szCs w:val="28"/>
-        </w:rPr>
-      </w:pPr>
-      <w:r>
-        <w:rPr>
-          <w:rFonts w:ascii="Times New Roman" w:hAnsi="Times New Roman"/>
-          <w:sz w:val="28"/>
-          <w:szCs w:val="28"/>
-        </w:rPr>
-      </w:r>
-    </w:p>
-    <w:p>
-      <w:pPr>
-        <w:pStyle w:val="PlainText"/>
-        <w:rPr>
-          <w:rFonts w:ascii="Times New Roman" w:hAnsi="Times New Roman"/>
-          <w:sz w:val="28"/>
-          <w:szCs w:val="28"/>
-        </w:rPr>
-      </w:pPr>
-      <w:r>
-        <w:rPr>
-          <w:rFonts w:ascii="Times New Roman" w:hAnsi="Times New Roman"/>
-          <w:sz w:val="28"/>
-          <w:szCs w:val="28"/>
-        </w:rPr>
-      </w:r>
-    </w:p>
-    <w:p>
-      <w:pPr>
-        <w:pStyle w:val="PlainText"/>
-        <w:rPr>
-          <w:rFonts w:ascii="Times New Roman" w:hAnsi="Times New Roman"/>
-          <w:sz w:val="28"/>
-          <w:szCs w:val="28"/>
-        </w:rPr>
-      </w:pPr>
-      <w:r>
-        <w:rPr>
-          <w:rFonts w:ascii="Times New Roman" w:hAnsi="Times New Roman"/>
-          <w:sz w:val="28"/>
-          <w:szCs w:val="28"/>
-        </w:rPr>
-      </w:r>
-    </w:p>
-    <w:p>
-      <w:pPr>
-        <w:pStyle w:val="PlainText"/>
-        <w:rPr>
-          <w:rFonts w:ascii="Times New Roman" w:hAnsi="Times New Roman"/>
-          <w:sz w:val="28"/>
-          <w:szCs w:val="28"/>
-        </w:rPr>
-      </w:pPr>
-      <w:r>
-        <w:rPr>
-          <w:rFonts w:ascii="Times New Roman" w:hAnsi="Times New Roman"/>
-          <w:sz w:val="28"/>
-          <w:szCs w:val="28"/>
-        </w:rPr>
-      </w:r>
-    </w:p>
-    <w:p>
-      <w:pPr>
-        <w:pStyle w:val="PlainText"/>
-        <w:rPr>
-          <w:rFonts w:ascii="Times New Roman" w:hAnsi="Times New Roman"/>
-          <w:sz w:val="28"/>
-          <w:szCs w:val="28"/>
-        </w:rPr>
-      </w:pPr>
-      <w:r>
-        <w:rPr>
-          <w:rFonts w:ascii="Times New Roman" w:hAnsi="Times New Roman"/>
-          <w:sz w:val="28"/>
-          <w:szCs w:val="28"/>
-        </w:rPr>
-      </w:r>
-    </w:p>
-    <w:p>
-      <w:pPr>
-        <w:pStyle w:val="Normal"/>
+      </w:pPr>
+    </w:p>
+    <w:p>
+      <w:pPr>
         <w:jc w:val="center"/>
         <w:rPr>
           <w:sz w:val="44"/>
@@ -677,7 +610,6 @@
     </w:p>
     <w:p>
       <w:pPr>
-        <w:pStyle w:val="Normal"/>
         <w:jc w:val="center"/>
         <w:rPr>
           <w:sz w:val="44"/>
@@ -694,37 +626,22 @@
     </w:p>
     <w:p>
       <w:pPr>
-        <w:pStyle w:val="Normal"/>
         <w:rPr>
           <w:sz w:val="44"/>
           <w:szCs w:val="28"/>
         </w:rPr>
       </w:pPr>
-      <w:r>
-        <w:rPr>
-          <w:sz w:val="44"/>
-          <w:szCs w:val="28"/>
-        </w:rPr>
-      </w:r>
-    </w:p>
-    <w:p>
-      <w:pPr>
-        <w:pStyle w:val="Normal"/>
-        <w:rPr>
-          <w:sz w:val="28"/>
-          <w:szCs w:val="28"/>
-        </w:rPr>
-      </w:pPr>
-      <w:r>
-        <w:rPr>
-          <w:sz w:val="28"/>
-          <w:szCs w:val="28"/>
-        </w:rPr>
-      </w:r>
-    </w:p>
-    <w:p>
-      <w:pPr>
-        <w:pStyle w:val="Normal"/>
+    </w:p>
+    <w:p>
+      <w:pPr>
+        <w:rPr>
+          <w:sz w:val="28"/>
+          <w:szCs w:val="28"/>
+        </w:rPr>
+      </w:pPr>
+    </w:p>
+    <w:p>
+      <w:pPr>
         <w:jc w:val="center"/>
         <w:rPr>
           <w:sz w:val="36"/>
@@ -755,70 +672,41 @@
     </w:p>
     <w:p>
       <w:pPr>
-        <w:pStyle w:val="Normal"/>
         <w:jc w:val="right"/>
         <w:rPr>
           <w:sz w:val="28"/>
           <w:szCs w:val="28"/>
         </w:rPr>
       </w:pPr>
-      <w:r>
-        <w:rPr>
-          <w:sz w:val="28"/>
-          <w:szCs w:val="28"/>
-        </w:rPr>
-      </w:r>
-    </w:p>
-    <w:p>
-      <w:pPr>
-        <w:pStyle w:val="Normal"/>
+    </w:p>
+    <w:p>
+      <w:pPr>
         <w:jc w:val="right"/>
         <w:rPr>
           <w:sz w:val="28"/>
           <w:szCs w:val="28"/>
         </w:rPr>
       </w:pPr>
-      <w:r>
-        <w:rPr>
-          <w:sz w:val="28"/>
-          <w:szCs w:val="28"/>
-        </w:rPr>
-      </w:r>
-    </w:p>
-    <w:p>
-      <w:pPr>
-        <w:pStyle w:val="Normal"/>
-        <w:rPr>
-          <w:sz w:val="28"/>
-          <w:szCs w:val="28"/>
-        </w:rPr>
-      </w:pPr>
-      <w:r>
-        <w:rPr>
-          <w:sz w:val="28"/>
-          <w:szCs w:val="28"/>
-        </w:rPr>
-      </w:r>
-    </w:p>
-    <w:p>
-      <w:pPr>
-        <w:pStyle w:val="Normal"/>
-        <w:rPr>
-          <w:sz w:val="28"/>
-          <w:szCs w:val="28"/>
-        </w:rPr>
-      </w:pPr>
-      <w:r>
-        <w:rPr>
-          <w:sz w:val="28"/>
-          <w:szCs w:val="28"/>
-        </w:rPr>
-      </w:r>
-    </w:p>
-    <w:p>
-      <w:pPr>
-        <w:pStyle w:val="Normal"/>
-        <w:ind w:hanging="284" w:left="6663"/>
+    </w:p>
+    <w:p>
+      <w:pPr>
+        <w:rPr>
+          <w:sz w:val="28"/>
+          <w:szCs w:val="28"/>
+        </w:rPr>
+      </w:pPr>
+    </w:p>
+    <w:p>
+      <w:pPr>
+        <w:rPr>
+          <w:sz w:val="28"/>
+          <w:szCs w:val="28"/>
+        </w:rPr>
+      </w:pPr>
+    </w:p>
+    <w:p>
+      <w:pPr>
+        <w:ind w:left="6663" w:hanging="284"/>
         <w:rPr>
           <w:sz w:val="28"/>
           <w:szCs w:val="28"/>
@@ -834,8 +722,7 @@
     </w:p>
     <w:p>
       <w:pPr>
-        <w:pStyle w:val="Normal"/>
-        <w:ind w:hanging="284" w:left="6663"/>
+        <w:ind w:left="6663" w:hanging="284"/>
         <w:rPr>
           <w:sz w:val="28"/>
           <w:szCs w:val="28"/>
@@ -851,43 +738,44 @@
     </w:p>
     <w:p>
       <w:pPr>
-        <w:pStyle w:val="Normal"/>
-        <w:ind w:hanging="284" w:left="6663"/>
-        <w:rPr>
-          <w:color w:themeColor="text1" w:val="000000"/>
-          <w:sz w:val="28"/>
-          <w:szCs w:val="28"/>
-        </w:rPr>
-      </w:pPr>
-      <w:r>
-        <w:rPr>
-          <w:color w:themeColor="text1" w:val="000000"/>
-          <w:sz w:val="28"/>
-          <w:szCs w:val="28"/>
-        </w:rPr>
-        <w:t>А.Ц. Нямаа</w:t>
-      </w:r>
-    </w:p>
-    <w:p>
-      <w:pPr>
-        <w:pStyle w:val="Normal"/>
+        <w:ind w:left="6663" w:hanging="284"/>
+        <w:rPr>
+          <w:color w:val="000000" w:themeColor="text1"/>
+          <w:sz w:val="28"/>
+          <w:szCs w:val="28"/>
+        </w:rPr>
+      </w:pPr>
+      <w:r>
+        <w:rPr>
+          <w:color w:val="000000" w:themeColor="text1"/>
+          <w:sz w:val="28"/>
+          <w:szCs w:val="28"/>
+        </w:rPr>
+        <w:t xml:space="preserve">А.Ц. </w:t>
+      </w:r>
+      <w:proofErr w:type="spellStart"/>
+      <w:r>
+        <w:rPr>
+          <w:color w:val="000000" w:themeColor="text1"/>
+          <w:sz w:val="28"/>
+          <w:szCs w:val="28"/>
+        </w:rPr>
+        <w:t>Нямаа</w:t>
+      </w:r>
+      <w:proofErr w:type="spellEnd"/>
+    </w:p>
+    <w:p>
+      <w:pPr>
         <w:jc w:val="right"/>
         <w:rPr>
           <w:sz w:val="28"/>
           <w:szCs w:val="28"/>
         </w:rPr>
       </w:pPr>
-      <w:r>
-        <w:rPr>
-          <w:sz w:val="28"/>
-          <w:szCs w:val="28"/>
-        </w:rPr>
-      </w:r>
-    </w:p>
-    <w:p>
-      <w:pPr>
-        <w:pStyle w:val="Normal"/>
-        <w:ind w:hanging="284" w:left="6663"/>
+    </w:p>
+    <w:p>
+      <w:pPr>
+        <w:ind w:left="6663" w:hanging="284"/>
         <w:rPr>
           <w:sz w:val="28"/>
           <w:szCs w:val="28"/>
@@ -903,8 +791,7 @@
     </w:p>
     <w:p>
       <w:pPr>
-        <w:pStyle w:val="Normal"/>
-        <w:ind w:hanging="284" w:left="6663"/>
+        <w:ind w:left="6663" w:hanging="284"/>
         <w:rPr>
           <w:sz w:val="28"/>
           <w:szCs w:val="28"/>
@@ -920,17 +807,16 @@
     </w:p>
     <w:p>
       <w:pPr>
-        <w:pStyle w:val="Normal"/>
-        <w:ind w:hanging="284" w:left="6663"/>
-        <w:rPr>
-          <w:color w:themeColor="text1" w:val="000000"/>
-          <w:sz w:val="28"/>
-          <w:szCs w:val="28"/>
-        </w:rPr>
-      </w:pPr>
-      <w:r>
-        <w:rPr>
-          <w:color w:themeColor="text1" w:val="000000"/>
+        <w:ind w:left="6663" w:hanging="284"/>
+        <w:rPr>
+          <w:color w:val="000000" w:themeColor="text1"/>
+          <w:sz w:val="28"/>
+          <w:szCs w:val="28"/>
+        </w:rPr>
+      </w:pPr>
+      <w:r>
+        <w:rPr>
+          <w:color w:val="000000" w:themeColor="text1"/>
           <w:sz w:val="28"/>
           <w:szCs w:val="28"/>
         </w:rPr>
@@ -939,168 +825,118 @@
     </w:p>
     <w:p>
       <w:pPr>
-        <w:pStyle w:val="PlainText"/>
+        <w:pStyle w:val="a4"/>
         <w:rPr>
           <w:rFonts w:ascii="Times New Roman" w:hAnsi="Times New Roman"/>
           <w:sz w:val="28"/>
           <w:szCs w:val="28"/>
         </w:rPr>
       </w:pPr>
-      <w:r>
+    </w:p>
+    <w:p>
+      <w:pPr>
+        <w:pStyle w:val="a4"/>
         <w:rPr>
           <w:rFonts w:ascii="Times New Roman" w:hAnsi="Times New Roman"/>
           <w:sz w:val="28"/>
           <w:szCs w:val="28"/>
         </w:rPr>
-      </w:r>
-    </w:p>
-    <w:p>
-      <w:pPr>
-        <w:pStyle w:val="PlainText"/>
+      </w:pPr>
+    </w:p>
+    <w:p>
+      <w:pPr>
+        <w:pStyle w:val="a4"/>
         <w:rPr>
           <w:rFonts w:ascii="Times New Roman" w:hAnsi="Times New Roman"/>
           <w:sz w:val="28"/>
           <w:szCs w:val="28"/>
         </w:rPr>
       </w:pPr>
-      <w:r>
+    </w:p>
+    <w:p>
+      <w:pPr>
+        <w:pStyle w:val="a4"/>
         <w:rPr>
           <w:rFonts w:ascii="Times New Roman" w:hAnsi="Times New Roman"/>
           <w:sz w:val="28"/>
           <w:szCs w:val="28"/>
         </w:rPr>
-      </w:r>
-    </w:p>
-    <w:p>
-      <w:pPr>
-        <w:pStyle w:val="PlainText"/>
+      </w:pPr>
+    </w:p>
+    <w:p>
+      <w:pPr>
+        <w:pStyle w:val="a4"/>
         <w:rPr>
           <w:rFonts w:ascii="Times New Roman" w:hAnsi="Times New Roman"/>
           <w:sz w:val="28"/>
           <w:szCs w:val="28"/>
         </w:rPr>
       </w:pPr>
-      <w:r>
+    </w:p>
+    <w:p>
+      <w:pPr>
+        <w:pStyle w:val="a4"/>
         <w:rPr>
           <w:rFonts w:ascii="Times New Roman" w:hAnsi="Times New Roman"/>
           <w:sz w:val="28"/>
           <w:szCs w:val="28"/>
         </w:rPr>
-      </w:r>
-    </w:p>
-    <w:p>
-      <w:pPr>
-        <w:pStyle w:val="PlainText"/>
+      </w:pPr>
+    </w:p>
+    <w:p>
+      <w:pPr>
+        <w:pStyle w:val="a4"/>
+        <w:jc w:val="center"/>
         <w:rPr>
           <w:rFonts w:ascii="Times New Roman" w:hAnsi="Times New Roman"/>
           <w:sz w:val="28"/>
           <w:szCs w:val="28"/>
         </w:rPr>
       </w:pPr>
-      <w:r>
+    </w:p>
+    <w:p>
+      <w:pPr>
+        <w:pStyle w:val="a4"/>
+        <w:jc w:val="center"/>
         <w:rPr>
           <w:rFonts w:ascii="Times New Roman" w:hAnsi="Times New Roman"/>
           <w:sz w:val="28"/>
           <w:szCs w:val="28"/>
         </w:rPr>
-      </w:r>
-    </w:p>
-    <w:p>
-      <w:pPr>
-        <w:pStyle w:val="PlainText"/>
+      </w:pPr>
+      <w:r>
         <w:rPr>
           <w:rFonts w:ascii="Times New Roman" w:hAnsi="Times New Roman"/>
           <w:sz w:val="28"/>
           <w:szCs w:val="28"/>
         </w:rPr>
-      </w:pPr>
-      <w:r>
-        <w:rPr>
-          <w:rFonts w:ascii="Times New Roman" w:hAnsi="Times New Roman"/>
-          <w:sz w:val="28"/>
-          <w:szCs w:val="28"/>
-        </w:rPr>
-      </w:r>
-    </w:p>
-    <w:p>
-      <w:pPr>
-        <w:pStyle w:val="PlainText"/>
-        <w:rPr>
-          <w:rFonts w:ascii="Times New Roman" w:hAnsi="Times New Roman"/>
-          <w:sz w:val="28"/>
-          <w:szCs w:val="28"/>
-        </w:rPr>
-      </w:pPr>
-      <w:r>
-        <w:rPr>
-          <w:rFonts w:ascii="Times New Roman" w:hAnsi="Times New Roman"/>
-          <w:sz w:val="28"/>
-          <w:szCs w:val="28"/>
-        </w:rPr>
-      </w:r>
-    </w:p>
-    <w:p>
-      <w:pPr>
-        <w:pStyle w:val="PlainText"/>
+        <w:t>Владимир, 2025 г.</w:t>
+      </w:r>
+      <w:r>
+        <w:br w:type="page"/>
+      </w:r>
+    </w:p>
+    <w:p>
+      <w:pPr>
+        <w:spacing w:line="360" w:lineRule="auto"/>
         <w:jc w:val="center"/>
         <w:rPr>
-          <w:rFonts w:ascii="Times New Roman" w:hAnsi="Times New Roman"/>
-          <w:sz w:val="28"/>
-          <w:szCs w:val="28"/>
-        </w:rPr>
-      </w:pPr>
-      <w:r>
-        <w:rPr>
-          <w:rFonts w:ascii="Times New Roman" w:hAnsi="Times New Roman"/>
-          <w:sz w:val="28"/>
-          <w:szCs w:val="28"/>
-        </w:rPr>
-      </w:r>
-    </w:p>
-    <w:p>
-      <w:pPr>
-        <w:pStyle w:val="PlainText"/>
-        <w:jc w:val="center"/>
-        <w:rPr>
-          <w:rFonts w:ascii="Times New Roman" w:hAnsi="Times New Roman"/>
-          <w:sz w:val="28"/>
-          <w:szCs w:val="28"/>
-        </w:rPr>
-      </w:pPr>
-      <w:r>
-        <w:rPr>
-          <w:rFonts w:ascii="Times New Roman" w:hAnsi="Times New Roman"/>
-          <w:sz w:val="28"/>
-          <w:szCs w:val="28"/>
-        </w:rPr>
-        <w:t>Владимир, 2025 г.</w:t>
-      </w:r>
-      <w:r>
-        <w:br w:type="page"/>
-      </w:r>
-    </w:p>
-    <w:p>
-      <w:pPr>
-        <w:pStyle w:val="Normal"/>
-        <w:spacing w:lineRule="auto" w:line="360" w:before="0" w:after="0"/>
-        <w:jc w:val="center"/>
-        <w:rPr>
-          <w:sz w:val="28"/>
-          <w:szCs w:val="28"/>
-        </w:rPr>
-      </w:pPr>
-      <w:r>
-        <w:rPr>
-          <w:sz w:val="28"/>
-          <w:szCs w:val="28"/>
-        </w:rPr>
+          <w:sz w:val="28"/>
+          <w:szCs w:val="28"/>
+        </w:rPr>
+      </w:pPr>
+      <w:r>
+        <w:rPr>
+          <w:sz w:val="28"/>
+          <w:szCs w:val="28"/>
+        </w:rPr>
+        <w:lastRenderedPageBreak/>
         <w:t>ЦЕЛЬ РАБОТЫ:</w:t>
       </w:r>
     </w:p>
     <w:p>
       <w:pPr>
-        <w:pStyle w:val="Normal"/>
-        <w:spacing w:lineRule="auto" w:line="360"/>
+        <w:spacing w:line="360" w:lineRule="auto"/>
         <w:ind w:firstLine="708"/>
         <w:jc w:val="both"/>
         <w:rPr>
@@ -1111,13 +947,24 @@
         <w:rPr>
           <w:sz w:val="28"/>
         </w:rPr>
-        <w:t>Выяснить назначение виртуальных машин. Научиться использовать их для работы с ОС. Узнать базовые принципы IP-адрессации. Научиться настраивать стек протоколов TCP/IP и уметь организовывать одноранговую сеть. Ознакомиться и уметь использовать основные консольные утилиты для получения информации о сетевой конфигурации системы и тестирования работоспособности сети.</w:t>
-      </w:r>
-    </w:p>
-    <w:p>
-      <w:pPr>
-        <w:pStyle w:val="Normal"/>
-        <w:spacing w:lineRule="auto" w:line="360"/>
+        <w:t>Выяснить назначение виртуальных машин. Научиться использовать их для работы с ОС. Узнать базовые принципы IP-</w:t>
+      </w:r>
+      <w:r>
+        <w:rPr>
+          <w:sz w:val="28"/>
+        </w:rPr>
+        <w:t>адресации</w:t>
+      </w:r>
+      <w:r>
+        <w:rPr>
+          <w:sz w:val="28"/>
+        </w:rPr>
+        <w:t>. Научиться настраивать стек протоколов TCP/IP и уметь организовывать одноранговую сеть. Ознакомиться и уметь использовать основные консольные утилиты для получения информации о сетевой конфигурации системы и тестирования работоспособности сети.</w:t>
+      </w:r>
+    </w:p>
+    <w:p>
+      <w:pPr>
+        <w:spacing w:line="360" w:lineRule="auto"/>
         <w:jc w:val="center"/>
         <w:rPr>
           <w:sz w:val="28"/>
@@ -1132,8 +979,7 @@
     </w:p>
     <w:p>
       <w:pPr>
-        <w:pStyle w:val="Normal"/>
-        <w:spacing w:lineRule="auto" w:line="360"/>
+        <w:spacing w:line="360" w:lineRule="auto"/>
         <w:ind w:firstLine="708"/>
         <w:jc w:val="both"/>
         <w:rPr>
@@ -1144,13 +990,128 @@
         <w:rPr>
           <w:sz w:val="28"/>
         </w:rPr>
-        <w:t>Выполнить все приведенные сетевые команды с различными параметрами.</w:t>
-      </w:r>
-    </w:p>
-    <w:p>
-      <w:pPr>
-        <w:pStyle w:val="Normal"/>
-        <w:spacing w:lineRule="auto" w:line="360"/>
+        <w:t xml:space="preserve">Установить ОС на виртуальной машину </w:t>
+      </w:r>
+      <w:r>
+        <w:rPr>
+          <w:sz w:val="28"/>
+          <w:lang w:val="en-US"/>
+        </w:rPr>
+        <w:t>Virtual</w:t>
+      </w:r>
+      <w:r>
+        <w:rPr>
+          <w:sz w:val="28"/>
+        </w:rPr>
+        <w:t xml:space="preserve"> </w:t>
+      </w:r>
+      <w:r>
+        <w:rPr>
+          <w:sz w:val="28"/>
+          <w:lang w:val="en-US"/>
+        </w:rPr>
+        <w:t>PC</w:t>
+      </w:r>
+      <w:r>
+        <w:rPr>
+          <w:sz w:val="28"/>
+        </w:rPr>
+        <w:t xml:space="preserve"> </w:t>
+      </w:r>
+      <w:r>
+        <w:rPr>
+          <w:sz w:val="28"/>
+        </w:rPr>
+        <w:t xml:space="preserve">или </w:t>
+      </w:r>
+      <w:r>
+        <w:rPr>
+          <w:sz w:val="28"/>
+          <w:lang w:val="en-US"/>
+        </w:rPr>
+        <w:t>Oracle</w:t>
+      </w:r>
+      <w:r>
+        <w:rPr>
+          <w:sz w:val="28"/>
+        </w:rPr>
+        <w:t xml:space="preserve"> </w:t>
+      </w:r>
+      <w:r>
+        <w:rPr>
+          <w:sz w:val="28"/>
+          <w:lang w:val="en-US"/>
+        </w:rPr>
+        <w:t>VM</w:t>
+      </w:r>
+      <w:r>
+        <w:rPr>
+          <w:sz w:val="28"/>
+        </w:rPr>
+        <w:t xml:space="preserve"> </w:t>
+      </w:r>
+      <w:r>
+        <w:rPr>
+          <w:sz w:val="28"/>
+          <w:lang w:val="en-US"/>
+        </w:rPr>
+        <w:t>Virtual</w:t>
+      </w:r>
+      <w:r>
+        <w:rPr>
+          <w:sz w:val="28"/>
+        </w:rPr>
+        <w:t xml:space="preserve"> </w:t>
+      </w:r>
+      <w:r>
+        <w:rPr>
+          <w:sz w:val="28"/>
+          <w:lang w:val="en-US"/>
+        </w:rPr>
+        <w:t>Box</w:t>
+      </w:r>
+      <w:r>
+        <w:rPr>
+          <w:sz w:val="28"/>
+        </w:rPr>
+        <w:t>.</w:t>
+      </w:r>
+      <w:r>
+        <w:rPr>
+          <w:sz w:val="28"/>
+        </w:rPr>
+        <w:t xml:space="preserve"> Настроить стек протоколов </w:t>
+      </w:r>
+      <w:r>
+        <w:rPr>
+          <w:sz w:val="28"/>
+          <w:lang w:val="en-US"/>
+        </w:rPr>
+        <w:t>TCP</w:t>
+      </w:r>
+      <w:r>
+        <w:rPr>
+          <w:sz w:val="28"/>
+        </w:rPr>
+        <w:t>/</w:t>
+      </w:r>
+      <w:r>
+        <w:rPr>
+          <w:sz w:val="28"/>
+          <w:lang w:val="en-US"/>
+        </w:rPr>
+        <w:t>IP</w:t>
+      </w:r>
+      <w:r>
+        <w:rPr>
+          <w:sz w:val="28"/>
+        </w:rPr>
+        <w:t>. Попытаться получить доступ к основной сети. Протестировать рассмотренные сетевые утилиты.</w:t>
+      </w:r>
+    </w:p>
+    <w:p>
+      <w:pPr>
+        <w:spacing w:line="360" w:lineRule="auto"/>
         <w:jc w:val="center"/>
         <w:rPr>
           <w:sz w:val="28"/>
@@ -1165,8 +1126,7 @@
     </w:p>
     <w:p>
       <w:pPr>
-        <w:pStyle w:val="Normal"/>
-        <w:spacing w:lineRule="auto" w:line="360"/>
+        <w:spacing w:line="360" w:lineRule="auto"/>
         <w:ind w:firstLine="709"/>
         <w:jc w:val="both"/>
         <w:rPr>
@@ -1177,36 +1137,172 @@
         <w:rPr>
           <w:sz w:val="28"/>
         </w:rPr>
-        <w:t xml:space="preserve">Данная лабораторная работы была выполнена на операционной системе </w:t>
+        <w:t xml:space="preserve">В ходе выполнения данной лабораторной работы использовался гипервизор </w:t>
       </w:r>
       <w:r>
         <w:rPr>
           <w:sz w:val="28"/>
           <w:lang w:val="en-US"/>
         </w:rPr>
+        <w:t>Virtual</w:t>
+      </w:r>
+      <w:r>
+        <w:rPr>
+          <w:sz w:val="28"/>
+        </w:rPr>
+        <w:t xml:space="preserve"> </w:t>
+      </w:r>
+      <w:r>
+        <w:rPr>
+          <w:sz w:val="28"/>
+          <w:lang w:val="en-US"/>
+        </w:rPr>
+        <w:t>Box</w:t>
+      </w:r>
+      <w:r>
+        <w:rPr>
+          <w:sz w:val="28"/>
+        </w:rPr>
+        <w:t xml:space="preserve"> и ОС для установки на виртуальные машины – </w:t>
+      </w:r>
+      <w:r>
+        <w:rPr>
+          <w:sz w:val="28"/>
+          <w:lang w:val="en-US"/>
+        </w:rPr>
+        <w:t>Rocky</w:t>
+      </w:r>
+      <w:r>
+        <w:rPr>
+          <w:sz w:val="28"/>
+        </w:rPr>
+        <w:t xml:space="preserve"> </w:t>
+      </w:r>
+      <w:r>
+        <w:rPr>
+          <w:sz w:val="28"/>
+          <w:lang w:val="en-US"/>
+        </w:rPr>
         <w:t>Linux</w:t>
       </w:r>
       <w:r>
         <w:rPr>
           <w:sz w:val="28"/>
         </w:rPr>
-        <w:t xml:space="preserve">, поэтому приведенные в методическом указании команды и утилиты были заменены на альтернативные, доступные на данной ОС. </w:t>
-      </w:r>
-    </w:p>
-    <w:p>
-      <w:pPr>
-        <w:pStyle w:val="Style20"/>
-        <w:spacing w:lineRule="auto" w:line="360"/>
+        <w:t xml:space="preserve"> без графического интерфейса</w:t>
+      </w:r>
+      <w:r>
+        <w:rPr>
+          <w:sz w:val="28"/>
+        </w:rPr>
+        <w:t>.</w:t>
+      </w:r>
+    </w:p>
+    <w:p>
+      <w:pPr>
+        <w:spacing w:line="360" w:lineRule="auto"/>
+        <w:ind w:firstLine="709"/>
+        <w:jc w:val="both"/>
+        <w:rPr>
+          <w:sz w:val="28"/>
+        </w:rPr>
+      </w:pPr>
+      <w:r>
+        <w:rPr>
+          <w:sz w:val="28"/>
+        </w:rPr>
+        <w:t xml:space="preserve">В начале выполнения </w:t>
+      </w:r>
+      <w:r>
+        <w:rPr>
+          <w:sz w:val="28"/>
+        </w:rPr>
+        <w:t xml:space="preserve">задания </w:t>
+      </w:r>
+      <w:r>
+        <w:rPr>
+          <w:sz w:val="28"/>
+        </w:rPr>
+        <w:t>я создал две виртуальные машины с некоторыми заданными настройками</w:t>
+      </w:r>
+      <w:r>
+        <w:rPr>
+          <w:sz w:val="28"/>
+        </w:rPr>
+        <w:t xml:space="preserve"> (количество места, выделенное на диске, количество оперативной памяти, ядер процессора и т.д.)</w:t>
+      </w:r>
+      <w:r>
+        <w:rPr>
+          <w:sz w:val="28"/>
+        </w:rPr>
+        <w:t xml:space="preserve"> и скач</w:t>
+      </w:r>
+      <w:r>
+        <w:rPr>
+          <w:sz w:val="28"/>
+        </w:rPr>
+        <w:t>а</w:t>
+      </w:r>
+      <w:r>
+        <w:rPr>
+          <w:sz w:val="28"/>
+        </w:rPr>
+        <w:t>нным образом</w:t>
+      </w:r>
+      <w:r>
+        <w:rPr>
+          <w:sz w:val="28"/>
+        </w:rPr>
+        <w:t xml:space="preserve"> </w:t>
+      </w:r>
+      <w:r>
+        <w:rPr>
+          <w:sz w:val="28"/>
+          <w:lang w:val="en-US"/>
+        </w:rPr>
+        <w:t>Rocky</w:t>
+      </w:r>
+      <w:r>
+        <w:rPr>
+          <w:sz w:val="28"/>
+        </w:rPr>
+        <w:t xml:space="preserve"> </w:t>
+      </w:r>
+      <w:r>
+        <w:rPr>
+          <w:sz w:val="28"/>
+          <w:lang w:val="en-US"/>
+        </w:rPr>
+        <w:t>Linux</w:t>
+      </w:r>
+      <w:r>
+        <w:rPr>
+          <w:sz w:val="28"/>
+        </w:rPr>
+        <w:t xml:space="preserve"> </w:t>
+      </w:r>
+      <w:r>
+        <w:rPr>
+          <w:sz w:val="28"/>
+        </w:rPr>
+        <w:t>ОС.</w:t>
+      </w:r>
+    </w:p>
+    <w:p>
+      <w:pPr>
+        <w:pStyle w:val="a8"/>
+        <w:spacing w:line="360" w:lineRule="auto"/>
         <w:jc w:val="center"/>
-        <w:rPr/>
-      </w:pPr>
-      <w:r>
-        <w:rPr/>
+      </w:pPr>
+      <w:r>
+        <w:rPr>
+          <w:noProof/>
+        </w:rPr>
         <w:drawing>
-          <wp:inline distT="0" distB="0" distL="0" distR="0">
-            <wp:extent cx="5940425" cy="3382010"/>
+          <wp:inline distT="0" distB="0" distL="0" distR="0" wp14:anchorId="15438270" wp14:editId="3AD759FC">
+            <wp:extent cx="5393897" cy="3070860"/>
             <wp:effectExtent l="0" t="0" r="0" b="0"/>
-            <wp:docPr id="1" name="Image1" descr=""/>
+            <wp:docPr id="1" name="Image1"/>
             <wp:cNvGraphicFramePr>
               <a:graphicFrameLocks xmlns:a="http://schemas.openxmlformats.org/drawingml/2006/main" noChangeAspect="1"/>
             </wp:cNvGraphicFramePr>
@@ -1214,321 +1310,7 @@
               <a:graphicData uri="http://schemas.openxmlformats.org/drawingml/2006/picture">
                 <pic:pic xmlns:pic="http://schemas.openxmlformats.org/drawingml/2006/picture">
                   <pic:nvPicPr>
-                    <pic:cNvPr id="1" name="Image1" descr=""/>
-                    <pic:cNvPicPr>
-                      <a:picLocks noChangeAspect="1" noChangeArrowheads="1"/>
-                    </pic:cNvPicPr>
-                  </pic:nvPicPr>
-                  <pic:blipFill>
-                    <a:blip r:embed="rId2"/>
-                    <a:stretch>
-                      <a:fillRect/>
-                    </a:stretch>
-                  </pic:blipFill>
-                  <pic:spPr bwMode="auto">
-                    <a:xfrm>
-                      <a:off x="0" y="0"/>
-                      <a:ext cx="5940425" cy="3382010"/>
-                    </a:xfrm>
-                    <a:prstGeom prst="rect">
-                      <a:avLst/>
-                    </a:prstGeom>
-                  </pic:spPr>
-                </pic:pic>
-              </a:graphicData>
-            </a:graphic>
-          </wp:inline>
-        </w:drawing>
-      </w:r>
-    </w:p>
-    <w:p>
-      <w:pPr>
-        <w:pStyle w:val="Normal"/>
-        <w:spacing w:lineRule="auto" w:line="360"/>
-        <w:jc w:val="center"/>
-        <w:rPr>
-          <w:sz w:val="28"/>
-          <w:szCs w:val="28"/>
-        </w:rPr>
-      </w:pPr>
-      <w:r>
-        <w:rPr>
-          <w:sz w:val="28"/>
-          <w:szCs w:val="28"/>
-        </w:rPr>
-        <w:t>Рисунок 1. Созданные вирутальные машины.</w:t>
-      </w:r>
-    </w:p>
-    <w:p>
-      <w:pPr>
-        <w:pStyle w:val="Normal"/>
-        <w:spacing w:lineRule="auto" w:line="360"/>
-        <w:jc w:val="center"/>
-        <w:rPr>
-          <w:sz w:val="28"/>
-          <w:szCs w:val="28"/>
-        </w:rPr>
-      </w:pPr>
-      <w:r>
-        <w:rPr>
-          <w:sz w:val="28"/>
-          <w:szCs w:val="28"/>
-        </w:rPr>
-        <w:t xml:space="preserve"> </w:t>
-      </w:r>
-    </w:p>
-    <w:p>
-      <w:pPr>
-        <w:pStyle w:val="Normal"/>
-        <w:spacing w:lineRule="auto" w:line="360"/>
-        <w:jc w:val="center"/>
-        <w:rPr>
-          <w:sz w:val="28"/>
-          <w:szCs w:val="28"/>
-        </w:rPr>
-      </w:pPr>
-      <w:r>
-        <w:rPr/>
-        <w:drawing>
-          <wp:inline distT="0" distB="0" distL="0" distR="0">
-            <wp:extent cx="5940425" cy="3573145"/>
-            <wp:effectExtent l="0" t="0" r="0" b="0"/>
-            <wp:docPr id="2" name="Image2" descr=""/>
-            <wp:cNvGraphicFramePr>
-              <a:graphicFrameLocks xmlns:a="http://schemas.openxmlformats.org/drawingml/2006/main" noChangeAspect="1"/>
-            </wp:cNvGraphicFramePr>
-            <a:graphic xmlns:a="http://schemas.openxmlformats.org/drawingml/2006/main">
-              <a:graphicData uri="http://schemas.openxmlformats.org/drawingml/2006/picture">
-                <pic:pic xmlns:pic="http://schemas.openxmlformats.org/drawingml/2006/picture">
-                  <pic:nvPicPr>
-                    <pic:cNvPr id="2" name="Image2" descr=""/>
-                    <pic:cNvPicPr>
-                      <a:picLocks noChangeAspect="1" noChangeArrowheads="1"/>
-                    </pic:cNvPicPr>
-                  </pic:nvPicPr>
-                  <pic:blipFill>
-                    <a:blip r:embed="rId3"/>
-                    <a:stretch>
-                      <a:fillRect/>
-                    </a:stretch>
-                  </pic:blipFill>
-                  <pic:spPr bwMode="auto">
-                    <a:xfrm>
-                      <a:off x="0" y="0"/>
-                      <a:ext cx="5940425" cy="3573145"/>
-                    </a:xfrm>
-                    <a:prstGeom prst="rect">
-                      <a:avLst/>
-                    </a:prstGeom>
-                  </pic:spPr>
-                </pic:pic>
-              </a:graphicData>
-            </a:graphic>
-          </wp:inline>
-        </w:drawing>
-      </w:r>
-    </w:p>
-    <w:p>
-      <w:pPr>
-        <w:pStyle w:val="Normal"/>
-        <w:spacing w:lineRule="auto" w:line="360"/>
-        <w:jc w:val="center"/>
-        <w:rPr>
-          <w:sz w:val="28"/>
-          <w:szCs w:val="28"/>
-        </w:rPr>
-      </w:pPr>
-      <w:r>
-        <w:rPr>
-          <w:sz w:val="28"/>
-          <w:szCs w:val="28"/>
-        </w:rPr>
-        <w:t>Рисунок 2. Установленный адаптер сети «Internal Network».</w:t>
-      </w:r>
-    </w:p>
-    <w:p>
-      <w:pPr>
-        <w:pStyle w:val="Normal"/>
-        <w:spacing w:lineRule="auto" w:line="360"/>
-        <w:jc w:val="center"/>
-        <w:rPr>
-          <w:sz w:val="28"/>
-          <w:szCs w:val="28"/>
-        </w:rPr>
-      </w:pPr>
-      <w:r>
-        <w:rPr>
-          <w:sz w:val="28"/>
-          <w:szCs w:val="28"/>
-        </w:rPr>
-      </w:r>
-    </w:p>
-    <w:p>
-      <w:pPr>
-        <w:pStyle w:val="Normal"/>
-        <w:spacing w:lineRule="auto" w:line="360"/>
-        <w:jc w:val="center"/>
-        <w:rPr>
-          <w:sz w:val="28"/>
-          <w:szCs w:val="28"/>
-        </w:rPr>
-      </w:pPr>
-      <w:r>
-        <w:rPr/>
-        <w:drawing>
-          <wp:inline distT="0" distB="0" distL="0" distR="0">
-            <wp:extent cx="5940425" cy="3573145"/>
-            <wp:effectExtent l="0" t="0" r="0" b="0"/>
-            <wp:docPr id="3" name="Image3" descr=""/>
-            <wp:cNvGraphicFramePr>
-              <a:graphicFrameLocks xmlns:a="http://schemas.openxmlformats.org/drawingml/2006/main" noChangeAspect="1"/>
-            </wp:cNvGraphicFramePr>
-            <a:graphic xmlns:a="http://schemas.openxmlformats.org/drawingml/2006/main">
-              <a:graphicData uri="http://schemas.openxmlformats.org/drawingml/2006/picture">
-                <pic:pic xmlns:pic="http://schemas.openxmlformats.org/drawingml/2006/picture">
-                  <pic:nvPicPr>
-                    <pic:cNvPr id="3" name="Image3" descr=""/>
-                    <pic:cNvPicPr>
-                      <a:picLocks noChangeAspect="1" noChangeArrowheads="1"/>
-                    </pic:cNvPicPr>
-                  </pic:nvPicPr>
-                  <pic:blipFill>
-                    <a:blip r:embed="rId4"/>
-                    <a:stretch>
-                      <a:fillRect/>
-                    </a:stretch>
-                  </pic:blipFill>
-                  <pic:spPr bwMode="auto">
-                    <a:xfrm>
-                      <a:off x="0" y="0"/>
-                      <a:ext cx="5940425" cy="3573145"/>
-                    </a:xfrm>
-                    <a:prstGeom prst="rect">
-                      <a:avLst/>
-                    </a:prstGeom>
-                  </pic:spPr>
-                </pic:pic>
-              </a:graphicData>
-            </a:graphic>
-          </wp:inline>
-        </w:drawing>
-      </w:r>
-      <w:r>
-        <w:rPr>
-          <w:sz w:val="28"/>
-          <w:szCs w:val="28"/>
-        </w:rPr>
-        <w:t>Рисунок 3. Установленный адаптер сети «Nat».</w:t>
-      </w:r>
-    </w:p>
-    <w:p>
-      <w:pPr>
-        <w:pStyle w:val="Normal"/>
-        <w:spacing w:lineRule="auto" w:line="360"/>
-        <w:jc w:val="center"/>
-        <w:rPr>
-          <w:sz w:val="28"/>
-          <w:szCs w:val="28"/>
-        </w:rPr>
-      </w:pPr>
-      <w:r>
-        <w:rPr/>
-        <w:drawing>
-          <wp:inline distT="0" distB="0" distL="0" distR="0">
-            <wp:extent cx="5940425" cy="4102100"/>
-            <wp:effectExtent l="0" t="0" r="0" b="0"/>
-            <wp:docPr id="4" name="Image6" descr=""/>
-            <wp:cNvGraphicFramePr>
-              <a:graphicFrameLocks xmlns:a="http://schemas.openxmlformats.org/drawingml/2006/main" noChangeAspect="1"/>
-            </wp:cNvGraphicFramePr>
-            <a:graphic xmlns:a="http://schemas.openxmlformats.org/drawingml/2006/main">
-              <a:graphicData uri="http://schemas.openxmlformats.org/drawingml/2006/picture">
-                <pic:pic xmlns:pic="http://schemas.openxmlformats.org/drawingml/2006/picture">
-                  <pic:nvPicPr>
-                    <pic:cNvPr id="4" name="Image6" descr=""/>
-                    <pic:cNvPicPr>
-                      <a:picLocks noChangeAspect="1" noChangeArrowheads="1"/>
-                    </pic:cNvPicPr>
-                  </pic:nvPicPr>
-                  <pic:blipFill>
-                    <a:blip r:embed="rId5"/>
-                    <a:stretch>
-                      <a:fillRect/>
-                    </a:stretch>
-                  </pic:blipFill>
-                  <pic:spPr bwMode="auto">
-                    <a:xfrm>
-                      <a:off x="0" y="0"/>
-                      <a:ext cx="5940425" cy="4102100"/>
-                    </a:xfrm>
-                    <a:prstGeom prst="rect">
-                      <a:avLst/>
-                    </a:prstGeom>
-                  </pic:spPr>
-                </pic:pic>
-              </a:graphicData>
-            </a:graphic>
-          </wp:inline>
-        </w:drawing>
-      </w:r>
-    </w:p>
-    <w:p>
-      <w:pPr>
-        <w:pStyle w:val="Normal"/>
-        <w:spacing w:lineRule="auto" w:line="360"/>
-        <w:jc w:val="center"/>
-        <w:rPr>
-          <w:sz w:val="28"/>
-          <w:szCs w:val="28"/>
-        </w:rPr>
-      </w:pPr>
-      <w:r>
-        <w:rPr>
-          <w:sz w:val="28"/>
-          <w:szCs w:val="28"/>
-        </w:rPr>
-        <w:t>Рисунок 4. Настройка сетевого интерфейса для внутреннего взаимодействия.</w:t>
-      </w:r>
-    </w:p>
-    <w:p>
-      <w:pPr>
-        <w:pStyle w:val="Normal"/>
-        <w:spacing w:lineRule="auto" w:line="360"/>
-        <w:jc w:val="center"/>
-        <w:rPr>
-          <w:sz w:val="28"/>
-          <w:szCs w:val="28"/>
-        </w:rPr>
-      </w:pPr>
-      <w:r>
-        <w:rPr/>
-      </w:r>
-    </w:p>
-    <w:p>
-      <w:pPr>
-        <w:pStyle w:val="Normal"/>
-        <w:spacing w:lineRule="auto" w:line="360"/>
-        <w:jc w:val="center"/>
-        <w:rPr>
-          <w:sz w:val="28"/>
-          <w:szCs w:val="28"/>
-        </w:rPr>
-      </w:pPr>
-      <w:r>
-        <w:rPr/>
-        <w:drawing>
-          <wp:inline distT="0" distB="0" distL="0" distR="0">
-            <wp:extent cx="5940425" cy="4102100"/>
-            <wp:effectExtent l="0" t="0" r="0" b="0"/>
-            <wp:docPr id="5" name="Image4" descr=""/>
-            <wp:cNvGraphicFramePr>
-              <a:graphicFrameLocks xmlns:a="http://schemas.openxmlformats.org/drawingml/2006/main" noChangeAspect="1"/>
-            </wp:cNvGraphicFramePr>
-            <a:graphic xmlns:a="http://schemas.openxmlformats.org/drawingml/2006/main">
-              <a:graphicData uri="http://schemas.openxmlformats.org/drawingml/2006/picture">
-                <pic:pic xmlns:pic="http://schemas.openxmlformats.org/drawingml/2006/picture">
-                  <pic:nvPicPr>
-                    <pic:cNvPr id="5" name="Image4" descr=""/>
+                    <pic:cNvPr id="1" name="Image1"/>
                     <pic:cNvPicPr>
                       <a:picLocks noChangeAspect="1" noChangeArrowheads="1"/>
                     </pic:cNvPicPr>
@@ -1542,7 +1324,7 @@
                   <pic:spPr bwMode="auto">
                     <a:xfrm>
                       <a:off x="0" y="0"/>
-                      <a:ext cx="5940425" cy="4102100"/>
+                      <a:ext cx="5401672" cy="3075287"/>
                     </a:xfrm>
                     <a:prstGeom prst="rect">
                       <a:avLst/>
@@ -1557,8 +1339,7 @@
     </w:p>
     <w:p>
       <w:pPr>
-        <w:pStyle w:val="Normal"/>
-        <w:spacing w:lineRule="auto" w:line="360"/>
+        <w:spacing w:line="360" w:lineRule="auto"/>
         <w:jc w:val="center"/>
         <w:rPr>
           <w:sz w:val="28"/>
@@ -1570,13 +1351,104 @@
           <w:sz w:val="28"/>
           <w:szCs w:val="28"/>
         </w:rPr>
-        <w:t>Рисунок 5. Сетевые интерфейсы на виртуальной машине.</w:t>
-      </w:r>
-    </w:p>
-    <w:p>
-      <w:pPr>
-        <w:pStyle w:val="Normal"/>
-        <w:spacing w:lineRule="auto" w:line="360"/>
+        <w:t xml:space="preserve">Рисунок 1. Созданные </w:t>
+      </w:r>
+      <w:proofErr w:type="spellStart"/>
+      <w:r>
+        <w:rPr>
+          <w:sz w:val="28"/>
+          <w:szCs w:val="28"/>
+        </w:rPr>
+        <w:t>вирутальные</w:t>
+      </w:r>
+      <w:proofErr w:type="spellEnd"/>
+      <w:r>
+        <w:rPr>
+          <w:sz w:val="28"/>
+          <w:szCs w:val="28"/>
+        </w:rPr>
+        <w:t xml:space="preserve"> машины.</w:t>
+      </w:r>
+    </w:p>
+    <w:p>
+      <w:pPr>
+        <w:spacing w:line="360" w:lineRule="auto"/>
+        <w:ind w:firstLine="709"/>
+        <w:jc w:val="both"/>
+        <w:rPr>
+          <w:sz w:val="28"/>
+          <w:szCs w:val="28"/>
+        </w:rPr>
+      </w:pPr>
+      <w:r>
+        <w:rPr>
+          <w:sz w:val="28"/>
+          <w:szCs w:val="28"/>
+        </w:rPr>
+        <w:lastRenderedPageBreak/>
+        <w:t xml:space="preserve"> </w:t>
+      </w:r>
+      <w:r>
+        <w:rPr>
+          <w:sz w:val="28"/>
+          <w:szCs w:val="28"/>
+        </w:rPr>
+        <w:t xml:space="preserve">Далее я отключил созданные виртуальные машины и каждой из них задал сетевой интерфейс </w:t>
+      </w:r>
+      <w:r>
+        <w:rPr>
+          <w:sz w:val="28"/>
+          <w:szCs w:val="28"/>
+        </w:rPr>
+        <w:t>типа «</w:t>
+      </w:r>
+      <w:r>
+        <w:rPr>
+          <w:sz w:val="28"/>
+          <w:szCs w:val="28"/>
+          <w:lang w:val="en-US"/>
+        </w:rPr>
+        <w:t>Internal</w:t>
+      </w:r>
+      <w:r>
+        <w:rPr>
+          <w:sz w:val="28"/>
+          <w:szCs w:val="28"/>
+        </w:rPr>
+        <w:t xml:space="preserve">» </w:t>
+      </w:r>
+      <w:r>
+        <w:rPr>
+          <w:sz w:val="28"/>
+          <w:szCs w:val="28"/>
+        </w:rPr>
+        <w:t xml:space="preserve">для </w:t>
+      </w:r>
+      <w:r>
+        <w:rPr>
+          <w:sz w:val="28"/>
+          <w:szCs w:val="28"/>
+        </w:rPr>
+        <w:t>внутреннего взаимодействия</w:t>
+      </w:r>
+      <w:r>
+        <w:rPr>
+          <w:sz w:val="28"/>
+          <w:szCs w:val="28"/>
+        </w:rPr>
+        <w:t xml:space="preserve"> между ними</w:t>
+      </w:r>
+      <w:r>
+        <w:rPr>
+          <w:sz w:val="28"/>
+          <w:szCs w:val="28"/>
+        </w:rPr>
+        <w:t>.</w:t>
+      </w:r>
+    </w:p>
+    <w:p>
+      <w:pPr>
+        <w:spacing w:line="360" w:lineRule="auto"/>
         <w:jc w:val="center"/>
         <w:rPr>
           <w:sz w:val="28"/>
@@ -1585,28 +1457,13 @@
       </w:pPr>
       <w:r>
         <w:rPr>
-          <w:sz w:val="28"/>
-          <w:szCs w:val="28"/>
-        </w:rPr>
-      </w:r>
-    </w:p>
-    <w:p>
-      <w:pPr>
-        <w:pStyle w:val="Normal"/>
-        <w:spacing w:lineRule="auto" w:line="360"/>
-        <w:jc w:val="center"/>
-        <w:rPr>
-          <w:sz w:val="28"/>
-          <w:szCs w:val="28"/>
-        </w:rPr>
-      </w:pPr>
-      <w:r>
-        <w:rPr/>
+          <w:noProof/>
+        </w:rPr>
         <w:drawing>
-          <wp:inline distT="0" distB="0" distL="0" distR="0">
-            <wp:extent cx="5940425" cy="4102100"/>
+          <wp:inline distT="0" distB="0" distL="0" distR="0" wp14:anchorId="5CB91497" wp14:editId="58A4A553">
+            <wp:extent cx="5471160" cy="3290884"/>
             <wp:effectExtent l="0" t="0" r="0" b="0"/>
-            <wp:docPr id="6" name="Image5" descr=""/>
+            <wp:docPr id="2" name="Image2"/>
             <wp:cNvGraphicFramePr>
               <a:graphicFrameLocks xmlns:a="http://schemas.openxmlformats.org/drawingml/2006/main" noChangeAspect="1"/>
             </wp:cNvGraphicFramePr>
@@ -1614,7 +1471,7 @@
               <a:graphicData uri="http://schemas.openxmlformats.org/drawingml/2006/picture">
                 <pic:pic xmlns:pic="http://schemas.openxmlformats.org/drawingml/2006/picture">
                   <pic:nvPicPr>
-                    <pic:cNvPr id="6" name="Image5" descr=""/>
+                    <pic:cNvPr id="2" name="Image2"/>
                     <pic:cNvPicPr>
                       <a:picLocks noChangeAspect="1" noChangeArrowheads="1"/>
                     </pic:cNvPicPr>
@@ -1628,7 +1485,7 @@
                   <pic:spPr bwMode="auto">
                     <a:xfrm>
                       <a:off x="0" y="0"/>
-                      <a:ext cx="5940425" cy="4102100"/>
+                      <a:ext cx="5479399" cy="3295839"/>
                     </a:xfrm>
                     <a:prstGeom prst="rect">
                       <a:avLst/>
@@ -1643,8 +1500,7 @@
     </w:p>
     <w:p>
       <w:pPr>
-        <w:pStyle w:val="Normal"/>
-        <w:spacing w:lineRule="auto" w:line="360"/>
+        <w:spacing w:line="360" w:lineRule="auto"/>
         <w:jc w:val="center"/>
         <w:rPr>
           <w:sz w:val="28"/>
@@ -1656,30 +1512,85 @@
           <w:sz w:val="28"/>
           <w:szCs w:val="28"/>
         </w:rPr>
-        <w:t>Рисунок 6. Проверка доступа виртуальной машины во внутренней сети.</w:t>
-      </w:r>
-    </w:p>
-    <w:p>
-      <w:pPr>
-        <w:pStyle w:val="Normal"/>
-        <w:spacing w:lineRule="auto" w:line="360"/>
+        <w:t>Рисунок 2. Установленный адаптер сети «</w:t>
+      </w:r>
+      <w:proofErr w:type="spellStart"/>
+      <w:r>
+        <w:rPr>
+          <w:sz w:val="28"/>
+          <w:szCs w:val="28"/>
+        </w:rPr>
+        <w:t>Internal</w:t>
+      </w:r>
+      <w:proofErr w:type="spellEnd"/>
+      <w:r>
+        <w:rPr>
+          <w:sz w:val="28"/>
+          <w:szCs w:val="28"/>
+        </w:rPr>
+        <w:t xml:space="preserve"> Network».</w:t>
+      </w:r>
+    </w:p>
+    <w:p>
+      <w:pPr>
+        <w:spacing w:line="360" w:lineRule="auto"/>
         <w:jc w:val="center"/>
         <w:rPr>
           <w:sz w:val="28"/>
           <w:szCs w:val="28"/>
         </w:rPr>
       </w:pPr>
-      <w:r>
-        <w:rPr>
-          <w:sz w:val="28"/>
-          <w:szCs w:val="28"/>
-        </w:rPr>
-      </w:r>
-    </w:p>
-    <w:p>
-      <w:pPr>
-        <w:pStyle w:val="Normal"/>
-        <w:spacing w:lineRule="auto" w:line="360"/>
+    </w:p>
+    <w:p>
+      <w:pPr>
+        <w:spacing w:line="360" w:lineRule="auto"/>
+        <w:ind w:firstLine="709"/>
+        <w:jc w:val="both"/>
+        <w:rPr>
+          <w:sz w:val="28"/>
+          <w:szCs w:val="28"/>
+        </w:rPr>
+      </w:pPr>
+      <w:r>
+        <w:rPr>
+          <w:sz w:val="28"/>
+          <w:szCs w:val="28"/>
+        </w:rPr>
+        <w:t>Также одной из машин задал дополнительный сетевой интерфейс</w:t>
+      </w:r>
+      <w:r>
+        <w:rPr>
+          <w:sz w:val="28"/>
+          <w:szCs w:val="28"/>
+        </w:rPr>
+        <w:t xml:space="preserve"> типа</w:t>
+      </w:r>
+      <w:r>
+        <w:rPr>
+          <w:sz w:val="28"/>
+          <w:szCs w:val="28"/>
+        </w:rPr>
+        <w:t xml:space="preserve"> «</w:t>
+      </w:r>
+      <w:r>
+        <w:rPr>
+          <w:sz w:val="28"/>
+          <w:szCs w:val="28"/>
+          <w:lang w:val="en-US"/>
+        </w:rPr>
+        <w:t>NAT</w:t>
+      </w:r>
+      <w:r>
+        <w:rPr>
+          <w:sz w:val="28"/>
+          <w:szCs w:val="28"/>
+        </w:rPr>
+        <w:t>» для получения доступа в глобальный интернет.</w:t>
+      </w:r>
+    </w:p>
+    <w:p>
+      <w:pPr>
+        <w:spacing w:line="360" w:lineRule="auto"/>
         <w:jc w:val="center"/>
         <w:rPr>
           <w:sz w:val="28"/>
@@ -1688,14 +1599,13 @@
       </w:pPr>
       <w:r>
         <w:rPr>
-          <w:sz w:val="28"/>
-          <w:szCs w:val="28"/>
+          <w:noProof/>
         </w:rPr>
         <w:drawing>
-          <wp:inline distT="0" distB="0" distL="0" distR="0">
-            <wp:extent cx="5582285" cy="1678305"/>
+          <wp:inline distT="0" distB="0" distL="0" distR="0" wp14:anchorId="1C65F45C" wp14:editId="15384056">
+            <wp:extent cx="5646420" cy="3418225"/>
             <wp:effectExtent l="0" t="0" r="0" b="0"/>
-            <wp:docPr id="7" name="Image7" descr=""/>
+            <wp:docPr id="3" name="Image3"/>
             <wp:cNvGraphicFramePr>
               <a:graphicFrameLocks xmlns:a="http://schemas.openxmlformats.org/drawingml/2006/main" noChangeAspect="1"/>
             </wp:cNvGraphicFramePr>
@@ -1703,13 +1613,589 @@
               <a:graphicData uri="http://schemas.openxmlformats.org/drawingml/2006/picture">
                 <pic:pic xmlns:pic="http://schemas.openxmlformats.org/drawingml/2006/picture">
                   <pic:nvPicPr>
-                    <pic:cNvPr id="7" name="Image7" descr=""/>
+                    <pic:cNvPr id="3" name="Image3"/>
+                    <pic:cNvPicPr>
+                      <a:picLocks noChangeAspect="1" noChangeArrowheads="1"/>
+                    </pic:cNvPicPr>
+                  </pic:nvPicPr>
+                  <pic:blipFill rotWithShape="1">
+                    <a:blip r:embed="rId8"/>
+                    <a:srcRect l="642"/>
+                    <a:stretch/>
+                  </pic:blipFill>
+                  <pic:spPr bwMode="auto">
+                    <a:xfrm>
+                      <a:off x="0" y="0"/>
+                      <a:ext cx="5662204" cy="3427780"/>
+                    </a:xfrm>
+                    <a:prstGeom prst="rect">
+                      <a:avLst/>
+                    </a:prstGeom>
+                    <a:ln>
+                      <a:noFill/>
+                    </a:ln>
+                    <a:extLst>
+                      <a:ext uri="{53640926-AAD7-44D8-BBD7-CCE9431645EC}">
+                        <a14:shadowObscured xmlns:a14="http://schemas.microsoft.com/office/drawing/2010/main"/>
+                      </a:ext>
+                    </a:extLst>
+                  </pic:spPr>
+                </pic:pic>
+              </a:graphicData>
+            </a:graphic>
+          </wp:inline>
+        </w:drawing>
+      </w:r>
+      <w:r>
+        <w:rPr>
+          <w:sz w:val="28"/>
+          <w:szCs w:val="28"/>
+        </w:rPr>
+        <w:t>Рисунок 3. Установленный адаптер сети «</w:t>
+      </w:r>
+      <w:proofErr w:type="spellStart"/>
+      <w:r>
+        <w:rPr>
+          <w:sz w:val="28"/>
+          <w:szCs w:val="28"/>
+        </w:rPr>
+        <w:t>Nat</w:t>
+      </w:r>
+      <w:proofErr w:type="spellEnd"/>
+      <w:r>
+        <w:rPr>
+          <w:sz w:val="28"/>
+          <w:szCs w:val="28"/>
+        </w:rPr>
+        <w:t>».</w:t>
+      </w:r>
+    </w:p>
+    <w:p>
+      <w:pPr>
+        <w:spacing w:line="360" w:lineRule="auto"/>
+        <w:ind w:firstLine="709"/>
+        <w:jc w:val="both"/>
+        <w:rPr>
+          <w:sz w:val="28"/>
+          <w:szCs w:val="28"/>
+        </w:rPr>
+      </w:pPr>
+      <w:r>
+        <w:rPr>
+          <w:sz w:val="28"/>
+          <w:szCs w:val="28"/>
+        </w:rPr>
+        <w:lastRenderedPageBreak/>
+        <w:t xml:space="preserve">Каждой виртуальной машине при помощи консольной утилиты </w:t>
+      </w:r>
+      <w:proofErr w:type="spellStart"/>
+      <w:r>
+        <w:rPr>
+          <w:sz w:val="28"/>
+          <w:szCs w:val="28"/>
+        </w:rPr>
+        <w:t>nmtui</w:t>
+      </w:r>
+      <w:proofErr w:type="spellEnd"/>
+      <w:r>
+        <w:rPr>
+          <w:sz w:val="28"/>
+          <w:szCs w:val="28"/>
+        </w:rPr>
+        <w:t xml:space="preserve"> определил статический </w:t>
+      </w:r>
+      <w:r>
+        <w:rPr>
+          <w:sz w:val="28"/>
+          <w:szCs w:val="28"/>
+          <w:lang w:val="en-US"/>
+        </w:rPr>
+        <w:t>IP</w:t>
+      </w:r>
+      <w:r>
+        <w:rPr>
+          <w:sz w:val="28"/>
+          <w:szCs w:val="28"/>
+        </w:rPr>
+        <w:t>-</w:t>
+      </w:r>
+      <w:proofErr w:type="spellStart"/>
+      <w:r>
+        <w:rPr>
+          <w:sz w:val="28"/>
+          <w:szCs w:val="28"/>
+        </w:rPr>
+        <w:t>адресс</w:t>
+      </w:r>
+      <w:proofErr w:type="spellEnd"/>
+      <w:r>
+        <w:rPr>
+          <w:sz w:val="28"/>
+          <w:szCs w:val="28"/>
+        </w:rPr>
+        <w:t xml:space="preserve"> и «</w:t>
+      </w:r>
+      <w:r>
+        <w:rPr>
+          <w:sz w:val="28"/>
+          <w:szCs w:val="28"/>
+          <w:lang w:val="en-US"/>
+        </w:rPr>
+        <w:t>Gateway</w:t>
+      </w:r>
+      <w:r>
+        <w:rPr>
+          <w:sz w:val="28"/>
+          <w:szCs w:val="28"/>
+        </w:rPr>
+        <w:t>».</w:t>
+      </w:r>
+    </w:p>
+    <w:p>
+      <w:pPr>
+        <w:spacing w:line="360" w:lineRule="auto"/>
+        <w:jc w:val="center"/>
+        <w:rPr>
+          <w:sz w:val="28"/>
+          <w:szCs w:val="28"/>
+        </w:rPr>
+      </w:pPr>
+      <w:r>
+        <w:rPr>
+          <w:noProof/>
+        </w:rPr>
+        <w:drawing>
+          <wp:inline distT="0" distB="0" distL="0" distR="0" wp14:anchorId="002D404F" wp14:editId="75F5124D">
+            <wp:extent cx="5052647" cy="3489054"/>
+            <wp:effectExtent l="0" t="0" r="0" b="0"/>
+            <wp:docPr id="4" name="Image6"/>
+            <wp:cNvGraphicFramePr>
+              <a:graphicFrameLocks xmlns:a="http://schemas.openxmlformats.org/drawingml/2006/main" noChangeAspect="1"/>
+            </wp:cNvGraphicFramePr>
+            <a:graphic xmlns:a="http://schemas.openxmlformats.org/drawingml/2006/main">
+              <a:graphicData uri="http://schemas.openxmlformats.org/drawingml/2006/picture">
+                <pic:pic xmlns:pic="http://schemas.openxmlformats.org/drawingml/2006/picture">
+                  <pic:nvPicPr>
+                    <pic:cNvPr id="4" name="Image6"/>
                     <pic:cNvPicPr>
                       <a:picLocks noChangeAspect="1" noChangeArrowheads="1"/>
                     </pic:cNvPicPr>
                   </pic:nvPicPr>
                   <pic:blipFill>
-                    <a:blip r:embed="rId8"/>
+                    <a:blip r:embed="rId9"/>
+                    <a:stretch>
+                      <a:fillRect/>
+                    </a:stretch>
+                  </pic:blipFill>
+                  <pic:spPr bwMode="auto">
+                    <a:xfrm>
+                      <a:off x="0" y="0"/>
+                      <a:ext cx="5067103" cy="3499036"/>
+                    </a:xfrm>
+                    <a:prstGeom prst="rect">
+                      <a:avLst/>
+                    </a:prstGeom>
+                  </pic:spPr>
+                </pic:pic>
+              </a:graphicData>
+            </a:graphic>
+          </wp:inline>
+        </w:drawing>
+      </w:r>
+    </w:p>
+    <w:p>
+      <w:pPr>
+        <w:spacing w:line="360" w:lineRule="auto"/>
+        <w:jc w:val="center"/>
+        <w:rPr>
+          <w:sz w:val="28"/>
+          <w:szCs w:val="28"/>
+        </w:rPr>
+      </w:pPr>
+      <w:r>
+        <w:rPr>
+          <w:sz w:val="28"/>
+          <w:szCs w:val="28"/>
+        </w:rPr>
+        <w:t>Рисунок 4. Настройка сетевого интерфейса для внутреннего взаимодействия.</w:t>
+      </w:r>
+    </w:p>
+    <w:p>
+      <w:pPr>
+        <w:spacing w:line="360" w:lineRule="auto"/>
+        <w:jc w:val="center"/>
+        <w:rPr>
+          <w:sz w:val="28"/>
+          <w:szCs w:val="28"/>
+        </w:rPr>
+      </w:pPr>
+    </w:p>
+    <w:p>
+      <w:pPr>
+        <w:spacing w:line="360" w:lineRule="auto"/>
+        <w:ind w:firstLine="709"/>
+        <w:jc w:val="both"/>
+        <w:rPr>
+          <w:sz w:val="28"/>
+          <w:szCs w:val="28"/>
+        </w:rPr>
+      </w:pPr>
+      <w:r>
+        <w:rPr>
+          <w:sz w:val="28"/>
+          <w:szCs w:val="28"/>
+        </w:rPr>
+        <w:t>Следующим шагом проверил все сетевые интерфейсы, доступные на виртуальных машинах</w:t>
+      </w:r>
+      <w:r>
+        <w:rPr>
+          <w:sz w:val="28"/>
+          <w:szCs w:val="28"/>
+        </w:rPr>
+        <w:t xml:space="preserve"> (см. рисунок 5)</w:t>
+      </w:r>
+      <w:r>
+        <w:rPr>
+          <w:sz w:val="28"/>
+          <w:szCs w:val="28"/>
+        </w:rPr>
+        <w:t xml:space="preserve">, и при помощи утилиты </w:t>
+      </w:r>
+      <w:r>
+        <w:rPr>
+          <w:sz w:val="28"/>
+          <w:szCs w:val="28"/>
+          <w:lang w:val="en-US"/>
+        </w:rPr>
+        <w:t>ping</w:t>
+      </w:r>
+      <w:r>
+        <w:rPr>
+          <w:sz w:val="28"/>
+          <w:szCs w:val="28"/>
+        </w:rPr>
+        <w:t xml:space="preserve"> </w:t>
+      </w:r>
+      <w:r>
+        <w:rPr>
+          <w:sz w:val="28"/>
+          <w:szCs w:val="28"/>
+        </w:rPr>
+        <w:t>проверил доступ к второй виртуальной машине в данной подсети</w:t>
+      </w:r>
+      <w:r>
+        <w:rPr>
+          <w:sz w:val="28"/>
+          <w:szCs w:val="28"/>
+        </w:rPr>
+        <w:t xml:space="preserve"> (см. рисунок 6).</w:t>
+      </w:r>
+      <w:r>
+        <w:rPr>
+          <w:sz w:val="28"/>
+          <w:szCs w:val="28"/>
+        </w:rPr>
+        <w:t xml:space="preserve"> </w:t>
+      </w:r>
+    </w:p>
+    <w:p>
+      <w:pPr>
+        <w:spacing w:line="360" w:lineRule="auto"/>
+        <w:jc w:val="center"/>
+        <w:rPr>
+          <w:sz w:val="28"/>
+          <w:szCs w:val="28"/>
+        </w:rPr>
+      </w:pPr>
+      <w:r>
+        <w:rPr>
+          <w:noProof/>
+        </w:rPr>
+        <w:drawing>
+          <wp:inline distT="0" distB="0" distL="0" distR="0" wp14:anchorId="60D12E15" wp14:editId="6B62EC86">
+            <wp:extent cx="5851858" cy="2356339"/>
+            <wp:effectExtent l="0" t="0" r="0" b="0"/>
+            <wp:docPr id="5" name="Image4"/>
+            <wp:cNvGraphicFramePr>
+              <a:graphicFrameLocks xmlns:a="http://schemas.openxmlformats.org/drawingml/2006/main" noChangeAspect="1"/>
+            </wp:cNvGraphicFramePr>
+            <a:graphic xmlns:a="http://schemas.openxmlformats.org/drawingml/2006/main">
+              <a:graphicData uri="http://schemas.openxmlformats.org/drawingml/2006/picture">
+                <pic:pic xmlns:pic="http://schemas.openxmlformats.org/drawingml/2006/picture">
+                  <pic:nvPicPr>
+                    <pic:cNvPr id="5" name="Image4"/>
+                    <pic:cNvPicPr>
+                      <a:picLocks noChangeAspect="1" noChangeArrowheads="1"/>
+                    </pic:cNvPicPr>
+                  </pic:nvPicPr>
+                  <pic:blipFill rotWithShape="1">
+                    <a:blip r:embed="rId10"/>
+                    <a:srcRect b="41688"/>
+                    <a:stretch/>
+                  </pic:blipFill>
+                  <pic:spPr bwMode="auto">
+                    <a:xfrm>
+                      <a:off x="0" y="0"/>
+                      <a:ext cx="5889503" cy="2371497"/>
+                    </a:xfrm>
+                    <a:prstGeom prst="rect">
+                      <a:avLst/>
+                    </a:prstGeom>
+                    <a:ln>
+                      <a:noFill/>
+                    </a:ln>
+                    <a:extLst>
+                      <a:ext uri="{53640926-AAD7-44D8-BBD7-CCE9431645EC}">
+                        <a14:shadowObscured xmlns:a14="http://schemas.microsoft.com/office/drawing/2010/main"/>
+                      </a:ext>
+                    </a:extLst>
+                  </pic:spPr>
+                </pic:pic>
+              </a:graphicData>
+            </a:graphic>
+          </wp:inline>
+        </w:drawing>
+      </w:r>
+    </w:p>
+    <w:p>
+      <w:pPr>
+        <w:spacing w:line="360" w:lineRule="auto"/>
+        <w:jc w:val="center"/>
+        <w:rPr>
+          <w:sz w:val="28"/>
+          <w:szCs w:val="28"/>
+        </w:rPr>
+      </w:pPr>
+      <w:r>
+        <w:rPr>
+          <w:sz w:val="28"/>
+          <w:szCs w:val="28"/>
+        </w:rPr>
+        <w:t>Рисунок 5. Сетевые интерфейсы на виртуальной машине.</w:t>
+      </w:r>
+    </w:p>
+    <w:p>
+      <w:pPr>
+        <w:widowControl/>
+        <w:rPr>
+          <w:sz w:val="28"/>
+          <w:szCs w:val="28"/>
+        </w:rPr>
+      </w:pPr>
+      <w:r>
+        <w:rPr>
+          <w:sz w:val="28"/>
+          <w:szCs w:val="28"/>
+        </w:rPr>
+        <w:br w:type="page"/>
+      </w:r>
+    </w:p>
+    <w:p>
+      <w:pPr>
+        <w:spacing w:line="360" w:lineRule="auto"/>
+        <w:jc w:val="center"/>
+        <w:rPr>
+          <w:sz w:val="28"/>
+          <w:szCs w:val="28"/>
+        </w:rPr>
+      </w:pPr>
+      <w:r>
+        <w:rPr>
+          <w:noProof/>
+        </w:rPr>
+        <w:lastRenderedPageBreak/>
+        <w:drawing>
+          <wp:inline distT="0" distB="0" distL="0" distR="0" wp14:anchorId="18DB41A7" wp14:editId="4FEFA42C">
+            <wp:extent cx="5861957" cy="2269672"/>
+            <wp:effectExtent l="0" t="0" r="0" b="0"/>
+            <wp:docPr id="6" name="Image5"/>
+            <wp:cNvGraphicFramePr>
+              <a:graphicFrameLocks xmlns:a="http://schemas.openxmlformats.org/drawingml/2006/main" noChangeAspect="1"/>
+            </wp:cNvGraphicFramePr>
+            <a:graphic xmlns:a="http://schemas.openxmlformats.org/drawingml/2006/main">
+              <a:graphicData uri="http://schemas.openxmlformats.org/drawingml/2006/picture">
+                <pic:pic xmlns:pic="http://schemas.openxmlformats.org/drawingml/2006/picture">
+                  <pic:nvPicPr>
+                    <pic:cNvPr id="6" name="Image5"/>
+                    <pic:cNvPicPr>
+                      <a:picLocks noChangeAspect="1" noChangeArrowheads="1"/>
+                    </pic:cNvPicPr>
+                  </pic:nvPicPr>
+                  <pic:blipFill rotWithShape="1">
+                    <a:blip r:embed="rId11"/>
+                    <a:srcRect t="1" r="463" b="44190"/>
+                    <a:stretch/>
+                  </pic:blipFill>
+                  <pic:spPr bwMode="auto">
+                    <a:xfrm>
+                      <a:off x="0" y="0"/>
+                      <a:ext cx="5902124" cy="2285224"/>
+                    </a:xfrm>
+                    <a:prstGeom prst="rect">
+                      <a:avLst/>
+                    </a:prstGeom>
+                    <a:ln>
+                      <a:noFill/>
+                    </a:ln>
+                    <a:extLst>
+                      <a:ext uri="{53640926-AAD7-44D8-BBD7-CCE9431645EC}">
+                        <a14:shadowObscured xmlns:a14="http://schemas.microsoft.com/office/drawing/2010/main"/>
+                      </a:ext>
+                    </a:extLst>
+                  </pic:spPr>
+                </pic:pic>
+              </a:graphicData>
+            </a:graphic>
+          </wp:inline>
+        </w:drawing>
+      </w:r>
+    </w:p>
+    <w:p>
+      <w:pPr>
+        <w:spacing w:line="360" w:lineRule="auto"/>
+        <w:jc w:val="center"/>
+        <w:rPr>
+          <w:sz w:val="28"/>
+          <w:szCs w:val="28"/>
+        </w:rPr>
+      </w:pPr>
+      <w:r>
+        <w:rPr>
+          <w:sz w:val="28"/>
+          <w:szCs w:val="28"/>
+        </w:rPr>
+        <w:t>Рисунок 6. Проверка доступа виртуальной машины во внутренней сети.</w:t>
+      </w:r>
+    </w:p>
+    <w:p>
+      <w:pPr>
+        <w:spacing w:line="360" w:lineRule="auto"/>
+        <w:jc w:val="center"/>
+        <w:rPr>
+          <w:sz w:val="28"/>
+          <w:szCs w:val="28"/>
+        </w:rPr>
+      </w:pPr>
+    </w:p>
+    <w:p>
+      <w:pPr>
+        <w:spacing w:line="360" w:lineRule="auto"/>
+        <w:ind w:firstLine="709"/>
+        <w:jc w:val="both"/>
+        <w:rPr>
+          <w:sz w:val="28"/>
+          <w:szCs w:val="28"/>
+        </w:rPr>
+      </w:pPr>
+      <w:r>
+        <w:rPr>
+          <w:sz w:val="28"/>
+          <w:szCs w:val="28"/>
+        </w:rPr>
+        <w:t>Также на виртуальной машине с дополнительным сетевым интерфейсом «</w:t>
+      </w:r>
+      <w:r>
+        <w:rPr>
+          <w:sz w:val="28"/>
+          <w:szCs w:val="28"/>
+          <w:lang w:val="en-US"/>
+        </w:rPr>
+        <w:t>NAT</w:t>
+      </w:r>
+      <w:r>
+        <w:rPr>
+          <w:sz w:val="28"/>
+          <w:szCs w:val="28"/>
+        </w:rPr>
+        <w:t xml:space="preserve">» проверил доступ в глобальный интернет при помощи утилиты </w:t>
+      </w:r>
+      <w:r>
+        <w:rPr>
+          <w:sz w:val="28"/>
+          <w:szCs w:val="28"/>
+          <w:lang w:val="en-US"/>
+        </w:rPr>
+        <w:t>ping</w:t>
+      </w:r>
+      <w:r>
+        <w:rPr>
+          <w:sz w:val="28"/>
+          <w:szCs w:val="28"/>
+        </w:rPr>
+        <w:t xml:space="preserve"> </w:t>
+      </w:r>
+      <w:r>
+        <w:rPr>
+          <w:sz w:val="28"/>
+          <w:szCs w:val="28"/>
+        </w:rPr>
+        <w:t xml:space="preserve">и доменного адреса </w:t>
+      </w:r>
+      <w:r>
+        <w:rPr>
+          <w:sz w:val="28"/>
+          <w:szCs w:val="28"/>
+          <w:lang w:val="en-US"/>
+        </w:rPr>
+        <w:t>google</w:t>
+      </w:r>
+      <w:r>
+        <w:rPr>
+          <w:sz w:val="28"/>
+          <w:szCs w:val="28"/>
+        </w:rPr>
+        <w:t>.</w:t>
+      </w:r>
+      <w:r>
+        <w:rPr>
+          <w:sz w:val="28"/>
+          <w:szCs w:val="28"/>
+          <w:lang w:val="en-US"/>
+        </w:rPr>
+        <w:t>com</w:t>
+      </w:r>
+      <w:r>
+        <w:rPr>
+          <w:sz w:val="28"/>
+          <w:szCs w:val="28"/>
+        </w:rPr>
+        <w:t>.</w:t>
+      </w:r>
+    </w:p>
+    <w:p>
+      <w:pPr>
+        <w:spacing w:line="360" w:lineRule="auto"/>
+        <w:jc w:val="center"/>
+        <w:rPr>
+          <w:sz w:val="28"/>
+          <w:szCs w:val="28"/>
+        </w:rPr>
+      </w:pPr>
+      <w:r>
+        <w:rPr>
+          <w:noProof/>
+          <w:sz w:val="28"/>
+          <w:szCs w:val="28"/>
+        </w:rPr>
+        <w:drawing>
+          <wp:inline distT="0" distB="0" distL="0" distR="0" wp14:anchorId="731B9CE5" wp14:editId="055EFBF9">
+            <wp:extent cx="5582285" cy="1678305"/>
+            <wp:effectExtent l="0" t="0" r="0" b="0"/>
+            <wp:docPr id="7" name="Image7"/>
+            <wp:cNvGraphicFramePr>
+              <a:graphicFrameLocks xmlns:a="http://schemas.openxmlformats.org/drawingml/2006/main" noChangeAspect="1"/>
+            </wp:cNvGraphicFramePr>
+            <a:graphic xmlns:a="http://schemas.openxmlformats.org/drawingml/2006/main">
+              <a:graphicData uri="http://schemas.openxmlformats.org/drawingml/2006/picture">
+                <pic:pic xmlns:pic="http://schemas.openxmlformats.org/drawingml/2006/picture">
+                  <pic:nvPicPr>
+                    <pic:cNvPr id="7" name="Image7"/>
+                    <pic:cNvPicPr>
+                      <a:picLocks noChangeAspect="1" noChangeArrowheads="1"/>
+                    </pic:cNvPicPr>
+                  </pic:nvPicPr>
+                  <pic:blipFill>
+                    <a:blip r:embed="rId12"/>
                     <a:stretch>
                       <a:fillRect/>
                     </a:stretch>
@@ -1732,8 +2218,7 @@
     </w:p>
     <w:p>
       <w:pPr>
-        <w:pStyle w:val="Normal"/>
-        <w:spacing w:lineRule="auto" w:line="360"/>
+        <w:spacing w:line="360" w:lineRule="auto"/>
         <w:jc w:val="center"/>
         <w:rPr>
           <w:sz w:val="28"/>
@@ -1745,30 +2230,36 @@
           <w:sz w:val="28"/>
           <w:szCs w:val="28"/>
         </w:rPr>
-        <w:t>Рисунок 7. Проверка доступа вирутальной машины во внешнюю сеть.</w:t>
-      </w:r>
-    </w:p>
-    <w:p>
-      <w:pPr>
-        <w:pStyle w:val="Normal"/>
-        <w:spacing w:lineRule="auto" w:line="360"/>
+        <w:t xml:space="preserve">Рисунок 7. Проверка доступа </w:t>
+      </w:r>
+      <w:r>
+        <w:rPr>
+          <w:sz w:val="28"/>
+          <w:szCs w:val="28"/>
+        </w:rPr>
+        <w:t>виртуальной</w:t>
+      </w:r>
+      <w:r>
+        <w:rPr>
+          <w:sz w:val="28"/>
+          <w:szCs w:val="28"/>
+        </w:rPr>
+        <w:t xml:space="preserve"> машины во внешнюю сеть.</w:t>
+      </w:r>
+    </w:p>
+    <w:p>
+      <w:pPr>
+        <w:spacing w:line="360" w:lineRule="auto"/>
         <w:jc w:val="center"/>
         <w:rPr>
           <w:sz w:val="28"/>
           <w:szCs w:val="28"/>
         </w:rPr>
       </w:pPr>
-      <w:r>
-        <w:rPr>
-          <w:sz w:val="28"/>
-          <w:szCs w:val="28"/>
-        </w:rPr>
-      </w:r>
-    </w:p>
-    <w:p>
-      <w:pPr>
-        <w:pStyle w:val="Normal"/>
-        <w:spacing w:lineRule="auto" w:line="360"/>
+    </w:p>
+    <w:p>
+      <w:pPr>
+        <w:spacing w:line="360" w:lineRule="auto"/>
         <w:jc w:val="center"/>
         <w:rPr>
           <w:sz w:val="28"/>
@@ -1785,8 +2276,7 @@
     </w:p>
     <w:p>
       <w:pPr>
-        <w:pStyle w:val="Normal"/>
-        <w:spacing w:lineRule="auto" w:line="360"/>
+        <w:spacing w:line="360" w:lineRule="auto"/>
         <w:ind w:firstLine="708"/>
         <w:jc w:val="both"/>
         <w:rPr>
@@ -1797,75 +2287,94 @@
         <w:rPr>
           <w:sz w:val="28"/>
         </w:rPr>
-        <w:t>Я выяснил назначение виртуальных машин. Научился использовать их для работы с ОС. Узнал базовые принципы IP-адрессации. Научился настраивать стек протоколов TCP/IP и организовывать одноранговую сеть. Ознакомился и научился использовать основные консольные утилиты для получения информации о сетевой конфигурации системы и тестирования работоспособности сети.</w:t>
+        <w:t>Я выяснил назначение виртуальных машин. Научился использовать их для работы с ОС. Узнал базовые принципы IP-</w:t>
+      </w:r>
+      <w:r>
+        <w:rPr>
+          <w:sz w:val="28"/>
+        </w:rPr>
+        <w:t>адресации</w:t>
+      </w:r>
+      <w:r>
+        <w:rPr>
+          <w:sz w:val="28"/>
+        </w:rPr>
+        <w:t>. Научился настраивать стек протоколов TCP/IP и организовывать одноранговую сеть. Ознакомился и научился использовать основные консольные утилиты для получения информации о сетевой конфигурации системы и тестирования работоспособности сети.</w:t>
       </w:r>
     </w:p>
     <w:sectPr>
-      <w:footerReference w:type="even" r:id="rId9"/>
-      <w:footerReference w:type="default" r:id="rId10"/>
-      <w:footerReference w:type="first" r:id="rId11"/>
-      <w:type w:val="nextPage"/>
+      <w:footerReference w:type="even" r:id="rId13"/>
+      <w:footerReference w:type="default" r:id="rId14"/>
+      <w:footerReference w:type="first" r:id="rId15"/>
       <w:pgSz w:w="11906" w:h="16838"/>
-      <w:pgMar w:left="1701" w:right="850" w:gutter="0" w:header="0" w:top="1134" w:footer="708" w:bottom="1134"/>
-      <w:pgNumType w:fmt="decimal"/>
-      <w:formProt w:val="false"/>
+      <w:pgMar w:top="1134" w:right="850" w:bottom="1134" w:left="1701" w:header="0" w:footer="708" w:gutter="0"/>
+      <w:cols w:space="720"/>
+      <w:formProt w:val="0"/>
       <w:titlePg/>
-      <w:textDirection w:val="lrTb"/>
-      <w:docGrid w:type="default" w:linePitch="360" w:charSpace="8192"/>
+      <w:docGrid w:linePitch="360" w:charSpace="8192"/>
     </w:sectPr>
   </w:body>
 </w:document>
 </file>
 
+<file path=word/endnotes.xml><?xml version="1.0" encoding="utf-8"?>
+<w:endnotes xmlns:wpc="http://schemas.microsoft.com/office/word/2010/wordprocessingCanvas" xmlns:cx="http://schemas.microsoft.com/office/drawing/2014/chartex" xmlns:cx1="http://schemas.microsoft.com/office/drawing/2015/9/8/chartex" xmlns:cx2="http://schemas.microsoft.com/office/drawing/2015/10/21/chartex" xmlns:cx3="http://schemas.microsoft.com/office/drawing/2016/5/9/chartex" xmlns:cx4="http://schemas.microsoft.com/office/drawing/2016/5/10/chartex" xmlns:cx5="http://schemas.microsoft.com/office/drawing/2016/5/11/chartex" xmlns:cx6="http://schemas.microsoft.com/office/drawing/2016/5/12/chartex" xmlns:cx7="http://schemas.microsoft.com/office/drawing/2016/5/13/chartex" xmlns:cx8="http://schemas.microsoft.com/office/drawing/2016/5/14/chartex" xmlns:mc="http://schemas.openxmlformats.org/markup-compatibility/2006" xmlns:aink="http://schemas.microsoft.com/office/drawing/2016/ink" xmlns:am3d="http://schemas.microsoft.com/office/drawing/2017/model3d" xmlns:o="urn:schemas-microsoft-com:office:office" xmlns:oel="http://schemas.microsoft.com/office/2019/extlst" xmlns:r="http://schemas.openxmlformats.org/officeDocument/2006/relationships" xmlns:m="http://schemas.openxmlformats.org/officeDocument/2006/math" xmlns:v="urn:schemas-microsoft-com:vml" xmlns:wp14="http://schemas.microsoft.com/office/word/2010/wordprocessingDrawing" xmlns:wp="http://schemas.openxmlformats.org/drawingml/2006/wordprocessingDrawing" xmlns:w10="urn:schemas-microsoft-com:office:word" xmlns:w="http://schemas.openxmlformats.org/wordprocessingml/2006/main" xmlns:w14="http://schemas.microsoft.com/office/word/2010/wordml" xmlns:w15="http://schemas.microsoft.com/office/word/2012/wordml" xmlns:w16cex="http://schemas.microsoft.com/office/word/2018/wordml/cex" xmlns:w16cid="http://schemas.microsoft.com/office/word/2016/wordml/cid" xmlns:w16="http://schemas.microsoft.com/office/word/2018/wordml" xmlns:w16sdtdh="http://schemas.microsoft.com/office/word/2020/wordml/sdtdatahash" xmlns:w16se="http://schemas.microsoft.com/office/word/2015/wordml/symex" xmlns:wpg="http://schemas.microsoft.com/office/word/2010/wordprocessingGroup" xmlns:wpi="http://schemas.microsoft.com/office/word/2010/wordprocessingInk" xmlns:wne="http://schemas.microsoft.com/office/word/2006/wordml" xmlns:wps="http://schemas.microsoft.com/office/word/2010/wordprocessingShape" mc:Ignorable="w14 w15 w16se w16cid w16 w16cex w16sdtdh wp14">
+  <w:endnote w:type="separator" w:id="-1">
+    <w:p>
+      <w:r>
+        <w:separator/>
+      </w:r>
+    </w:p>
+  </w:endnote>
+  <w:endnote w:type="continuationSeparator" w:id="0">
+    <w:p>
+      <w:r>
+        <w:continuationSeparator/>
+      </w:r>
+    </w:p>
+  </w:endnote>
+</w:endnotes>
+</file>
+
 <file path=word/footer1.xml><?xml version="1.0" encoding="utf-8"?>
-<w:ftr xmlns:o="urn:schemas-microsoft-com:office:office" xmlns:r="http://schemas.openxmlformats.org/officeDocument/2006/relationships" xmlns:v="urn:schemas-microsoft-com:vml" xmlns:w="http://schemas.openxmlformats.org/wordprocessingml/2006/main" xmlns:w10="urn:schemas-microsoft-com:office:word" xmlns:wp="http://schemas.openxmlformats.org/drawingml/2006/wordprocessingDrawing" xmlns:wps="http://schemas.microsoft.com/office/word/2010/wordprocessingShape" xmlns:wpg="http://schemas.microsoft.com/office/word/2010/wordprocessingGroup" xmlns:mc="http://schemas.openxmlformats.org/markup-compatibility/2006" xmlns:wp14="http://schemas.microsoft.com/office/word/2010/wordprocessingDrawing" xmlns:w14="http://schemas.microsoft.com/office/word/2010/wordml" xmlns:w15="http://schemas.microsoft.com/office/word/2012/wordml" mc:Ignorable="w14 wp14 w15">
+<w:ftr xmlns:wpc="http://schemas.microsoft.com/office/word/2010/wordprocessingCanvas" xmlns:cx="http://schemas.microsoft.com/office/drawing/2014/chartex" xmlns:cx1="http://schemas.microsoft.com/office/drawing/2015/9/8/chartex" xmlns:cx2="http://schemas.microsoft.com/office/drawing/2015/10/21/chartex" xmlns:cx3="http://schemas.microsoft.com/office/drawing/2016/5/9/chartex" xmlns:cx4="http://schemas.microsoft.com/office/drawing/2016/5/10/chartex" xmlns:cx5="http://schemas.microsoft.com/office/drawing/2016/5/11/chartex" xmlns:cx6="http://schemas.microsoft.com/office/drawing/2016/5/12/chartex" xmlns:cx7="http://schemas.microsoft.com/office/drawing/2016/5/13/chartex" xmlns:cx8="http://schemas.microsoft.com/office/drawing/2016/5/14/chartex" xmlns:mc="http://schemas.openxmlformats.org/markup-compatibility/2006" xmlns:aink="http://schemas.microsoft.com/office/drawing/2016/ink" xmlns:am3d="http://schemas.microsoft.com/office/drawing/2017/model3d" xmlns:o="urn:schemas-microsoft-com:office:office" xmlns:oel="http://schemas.microsoft.com/office/2019/extlst" xmlns:r="http://schemas.openxmlformats.org/officeDocument/2006/relationships" xmlns:m="http://schemas.openxmlformats.org/officeDocument/2006/math" xmlns:v="urn:schemas-microsoft-com:vml" xmlns:wp14="http://schemas.microsoft.com/office/word/2010/wordprocessingDrawing" xmlns:wp="http://schemas.openxmlformats.org/drawingml/2006/wordprocessingDrawing" xmlns:w10="urn:schemas-microsoft-com:office:word" xmlns:w="http://schemas.openxmlformats.org/wordprocessingml/2006/main" xmlns:w14="http://schemas.microsoft.com/office/word/2010/wordml" xmlns:w15="http://schemas.microsoft.com/office/word/2012/wordml" xmlns:w16cex="http://schemas.microsoft.com/office/word/2018/wordml/cex" xmlns:w16cid="http://schemas.microsoft.com/office/word/2016/wordml/cid" xmlns:w16="http://schemas.microsoft.com/office/word/2018/wordml" xmlns:w16sdtdh="http://schemas.microsoft.com/office/word/2020/wordml/sdtdatahash" xmlns:w16se="http://schemas.microsoft.com/office/word/2015/wordml/symex" xmlns:wpg="http://schemas.microsoft.com/office/word/2010/wordprocessingGroup" xmlns:wpi="http://schemas.microsoft.com/office/word/2010/wordprocessingInk" xmlns:wne="http://schemas.microsoft.com/office/word/2006/wordml" xmlns:wps="http://schemas.microsoft.com/office/word/2010/wordprocessingShape" mc:Ignorable="w14 w15 w16se w16cid w16 w16cex w16sdtdh wp14">
   <w:p>
     <w:pPr>
-      <w:pStyle w:val="Footer"/>
-      <w:rPr/>
+      <w:pStyle w:val="ae"/>
     </w:pPr>
-    <w:r>
-      <w:rPr/>
-    </w:r>
   </w:p>
 </w:ftr>
 </file>
 
 <file path=word/footer2.xml><?xml version="1.0" encoding="utf-8"?>
-<w:ftr xmlns:o="urn:schemas-microsoft-com:office:office" xmlns:r="http://schemas.openxmlformats.org/officeDocument/2006/relationships" xmlns:v="urn:schemas-microsoft-com:vml" xmlns:w="http://schemas.openxmlformats.org/wordprocessingml/2006/main" xmlns:w10="urn:schemas-microsoft-com:office:word" xmlns:wp="http://schemas.openxmlformats.org/drawingml/2006/wordprocessingDrawing" xmlns:wps="http://schemas.microsoft.com/office/word/2010/wordprocessingShape" xmlns:wpg="http://schemas.microsoft.com/office/word/2010/wordprocessingGroup" xmlns:mc="http://schemas.openxmlformats.org/markup-compatibility/2006" xmlns:wp14="http://schemas.microsoft.com/office/word/2010/wordprocessingDrawing" xmlns:w14="http://schemas.microsoft.com/office/word/2010/wordml" xmlns:w15="http://schemas.microsoft.com/office/word/2012/wordml" mc:Ignorable="w14 wp14 w15">
+<w:ftr xmlns:wpc="http://schemas.microsoft.com/office/word/2010/wordprocessingCanvas" xmlns:cx="http://schemas.microsoft.com/office/drawing/2014/chartex" xmlns:cx1="http://schemas.microsoft.com/office/drawing/2015/9/8/chartex" xmlns:cx2="http://schemas.microsoft.com/office/drawing/2015/10/21/chartex" xmlns:cx3="http://schemas.microsoft.com/office/drawing/2016/5/9/chartex" xmlns:cx4="http://schemas.microsoft.com/office/drawing/2016/5/10/chartex" xmlns:cx5="http://schemas.microsoft.com/office/drawing/2016/5/11/chartex" xmlns:cx6="http://schemas.microsoft.com/office/drawing/2016/5/12/chartex" xmlns:cx7="http://schemas.microsoft.com/office/drawing/2016/5/13/chartex" xmlns:cx8="http://schemas.microsoft.com/office/drawing/2016/5/14/chartex" xmlns:mc="http://schemas.openxmlformats.org/markup-compatibility/2006" xmlns:aink="http://schemas.microsoft.com/office/drawing/2016/ink" xmlns:am3d="http://schemas.microsoft.com/office/drawing/2017/model3d" xmlns:o="urn:schemas-microsoft-com:office:office" xmlns:oel="http://schemas.microsoft.com/office/2019/extlst" xmlns:r="http://schemas.openxmlformats.org/officeDocument/2006/relationships" xmlns:m="http://schemas.openxmlformats.org/officeDocument/2006/math" xmlns:v="urn:schemas-microsoft-com:vml" xmlns:wp14="http://schemas.microsoft.com/office/word/2010/wordprocessingDrawing" xmlns:wp="http://schemas.openxmlformats.org/drawingml/2006/wordprocessingDrawing" xmlns:w10="urn:schemas-microsoft-com:office:word" xmlns:w="http://schemas.openxmlformats.org/wordprocessingml/2006/main" xmlns:w14="http://schemas.microsoft.com/office/word/2010/wordml" xmlns:w15="http://schemas.microsoft.com/office/word/2012/wordml" xmlns:w16cex="http://schemas.microsoft.com/office/word/2018/wordml/cex" xmlns:w16cid="http://schemas.microsoft.com/office/word/2016/wordml/cid" xmlns:w16="http://schemas.microsoft.com/office/word/2018/wordml" xmlns:w16sdtdh="http://schemas.microsoft.com/office/word/2020/wordml/sdtdatahash" xmlns:w16se="http://schemas.microsoft.com/office/word/2015/wordml/symex" xmlns:wpg="http://schemas.microsoft.com/office/word/2010/wordprocessingGroup" xmlns:wpi="http://schemas.microsoft.com/office/word/2010/wordprocessingInk" xmlns:wne="http://schemas.microsoft.com/office/word/2006/wordml" xmlns:wps="http://schemas.microsoft.com/office/word/2010/wordprocessingShape" mc:Ignorable="w14 w15 w16se w16cid w16 w16cex w16sdtdh wp14">
   <w:sdt>
     <w:sdtPr>
+      <w:id w:val="-400750695"/>
       <w:docPartObj>
         <w:docPartGallery w:val="Page Numbers (Bottom of Page)"/>
-        <w:docPartUnique w:val="true"/>
+        <w:docPartUnique/>
       </w:docPartObj>
-      <w:id w:val="-400750695"/>
     </w:sdtPr>
     <w:sdtContent>
       <w:p>
         <w:pPr>
-          <w:pStyle w:val="Footer"/>
+          <w:pStyle w:val="ae"/>
           <w:jc w:val="center"/>
-          <w:rPr/>
         </w:pPr>
         <w:r>
-          <w:rPr/>
           <w:fldChar w:fldCharType="begin"/>
         </w:r>
         <w:r>
-          <w:rPr/>
           <w:instrText xml:space="preserve"> PAGE </w:instrText>
         </w:r>
         <w:r>
-          <w:rPr/>
           <w:fldChar w:fldCharType="separate"/>
         </w:r>
         <w:r>
-          <w:rPr/>
           <w:t>4</w:t>
         </w:r>
         <w:r>
-          <w:rPr/>
           <w:fldChar w:fldCharType="end"/>
         </w:r>
       </w:p>
@@ -1873,36 +2382,47 @@
   </w:sdt>
   <w:p>
     <w:pPr>
-      <w:pStyle w:val="Footer"/>
-      <w:rPr/>
+      <w:pStyle w:val="ae"/>
     </w:pPr>
-    <w:r>
-      <w:rPr/>
-    </w:r>
   </w:p>
 </w:ftr>
 </file>
 
 <file path=word/footer3.xml><?xml version="1.0" encoding="utf-8"?>
-<w:ftr xmlns:o="urn:schemas-microsoft-com:office:office" xmlns:r="http://schemas.openxmlformats.org/officeDocument/2006/relationships" xmlns:v="urn:schemas-microsoft-com:vml" xmlns:w="http://schemas.openxmlformats.org/wordprocessingml/2006/main" xmlns:w10="urn:schemas-microsoft-com:office:word" xmlns:wp="http://schemas.openxmlformats.org/drawingml/2006/wordprocessingDrawing" xmlns:wps="http://schemas.microsoft.com/office/word/2010/wordprocessingShape" xmlns:wpg="http://schemas.microsoft.com/office/word/2010/wordprocessingGroup" xmlns:mc="http://schemas.openxmlformats.org/markup-compatibility/2006" xmlns:wp14="http://schemas.microsoft.com/office/word/2010/wordprocessingDrawing" xmlns:w14="http://schemas.microsoft.com/office/word/2010/wordml" xmlns:w15="http://schemas.microsoft.com/office/word/2012/wordml" mc:Ignorable="w14 wp14 w15">
+<w:ftr xmlns:wpc="http://schemas.microsoft.com/office/word/2010/wordprocessingCanvas" xmlns:cx="http://schemas.microsoft.com/office/drawing/2014/chartex" xmlns:cx1="http://schemas.microsoft.com/office/drawing/2015/9/8/chartex" xmlns:cx2="http://schemas.microsoft.com/office/drawing/2015/10/21/chartex" xmlns:cx3="http://schemas.microsoft.com/office/drawing/2016/5/9/chartex" xmlns:cx4="http://schemas.microsoft.com/office/drawing/2016/5/10/chartex" xmlns:cx5="http://schemas.microsoft.com/office/drawing/2016/5/11/chartex" xmlns:cx6="http://schemas.microsoft.com/office/drawing/2016/5/12/chartex" xmlns:cx7="http://schemas.microsoft.com/office/drawing/2016/5/13/chartex" xmlns:cx8="http://schemas.microsoft.com/office/drawing/2016/5/14/chartex" xmlns:mc="http://schemas.openxmlformats.org/markup-compatibility/2006" xmlns:aink="http://schemas.microsoft.com/office/drawing/2016/ink" xmlns:am3d="http://schemas.microsoft.com/office/drawing/2017/model3d" xmlns:o="urn:schemas-microsoft-com:office:office" xmlns:oel="http://schemas.microsoft.com/office/2019/extlst" xmlns:r="http://schemas.openxmlformats.org/officeDocument/2006/relationships" xmlns:m="http://schemas.openxmlformats.org/officeDocument/2006/math" xmlns:v="urn:schemas-microsoft-com:vml" xmlns:wp14="http://schemas.microsoft.com/office/word/2010/wordprocessingDrawing" xmlns:wp="http://schemas.openxmlformats.org/drawingml/2006/wordprocessingDrawing" xmlns:w10="urn:schemas-microsoft-com:office:word" xmlns:w="http://schemas.openxmlformats.org/wordprocessingml/2006/main" xmlns:w14="http://schemas.microsoft.com/office/word/2010/wordml" xmlns:w15="http://schemas.microsoft.com/office/word/2012/wordml" xmlns:w16cex="http://schemas.microsoft.com/office/word/2018/wordml/cex" xmlns:w16cid="http://schemas.microsoft.com/office/word/2016/wordml/cid" xmlns:w16="http://schemas.microsoft.com/office/word/2018/wordml" xmlns:w16sdtdh="http://schemas.microsoft.com/office/word/2020/wordml/sdtdatahash" xmlns:w16se="http://schemas.microsoft.com/office/word/2015/wordml/symex" xmlns:wpg="http://schemas.microsoft.com/office/word/2010/wordprocessingGroup" xmlns:wpi="http://schemas.microsoft.com/office/word/2010/wordprocessingInk" xmlns:wne="http://schemas.microsoft.com/office/word/2006/wordml" xmlns:wps="http://schemas.microsoft.com/office/word/2010/wordprocessingShape" mc:Ignorable="w14 w15 w16se w16cid w16 w16cex w16sdtdh wp14">
   <w:p>
     <w:pPr>
-      <w:pStyle w:val="Footer"/>
-      <w:rPr/>
+      <w:pStyle w:val="ae"/>
     </w:pPr>
-    <w:r>
-      <w:rPr/>
-    </w:r>
   </w:p>
 </w:ftr>
 </file>
 
+<file path=word/footnotes.xml><?xml version="1.0" encoding="utf-8"?>
+<w:footnotes xmlns:wpc="http://schemas.microsoft.com/office/word/2010/wordprocessingCanvas" xmlns:cx="http://schemas.microsoft.com/office/drawing/2014/chartex" xmlns:cx1="http://schemas.microsoft.com/office/drawing/2015/9/8/chartex" xmlns:cx2="http://schemas.microsoft.com/office/drawing/2015/10/21/chartex" xmlns:cx3="http://schemas.microsoft.com/office/drawing/2016/5/9/chartex" xmlns:cx4="http://schemas.microsoft.com/office/drawing/2016/5/10/chartex" xmlns:cx5="http://schemas.microsoft.com/office/drawing/2016/5/11/chartex" xmlns:cx6="http://schemas.microsoft.com/office/drawing/2016/5/12/chartex" xmlns:cx7="http://schemas.microsoft.com/office/drawing/2016/5/13/chartex" xmlns:cx8="http://schemas.microsoft.com/office/drawing/2016/5/14/chartex" xmlns:mc="http://schemas.openxmlformats.org/markup-compatibility/2006" xmlns:aink="http://schemas.microsoft.com/office/drawing/2016/ink" xmlns:am3d="http://schemas.microsoft.com/office/drawing/2017/model3d" xmlns:o="urn:schemas-microsoft-com:office:office" xmlns:oel="http://schemas.microsoft.com/office/2019/extlst" xmlns:r="http://schemas.openxmlformats.org/officeDocument/2006/relationships" xmlns:m="http://schemas.openxmlformats.org/officeDocument/2006/math" xmlns:v="urn:schemas-microsoft-com:vml" xmlns:wp14="http://schemas.microsoft.com/office/word/2010/wordprocessingDrawing" xmlns:wp="http://schemas.openxmlformats.org/drawingml/2006/wordprocessingDrawing" xmlns:w10="urn:schemas-microsoft-com:office:word" xmlns:w="http://schemas.openxmlformats.org/wordprocessingml/2006/main" xmlns:w14="http://schemas.microsoft.com/office/word/2010/wordml" xmlns:w15="http://schemas.microsoft.com/office/word/2012/wordml" xmlns:w16cex="http://schemas.microsoft.com/office/word/2018/wordml/cex" xmlns:w16cid="http://schemas.microsoft.com/office/word/2016/wordml/cid" xmlns:w16="http://schemas.microsoft.com/office/word/2018/wordml" xmlns:w16sdtdh="http://schemas.microsoft.com/office/word/2020/wordml/sdtdatahash" xmlns:w16se="http://schemas.microsoft.com/office/word/2015/wordml/symex" xmlns:wpg="http://schemas.microsoft.com/office/word/2010/wordprocessingGroup" xmlns:wpi="http://schemas.microsoft.com/office/word/2010/wordprocessingInk" xmlns:wne="http://schemas.microsoft.com/office/word/2006/wordml" xmlns:wps="http://schemas.microsoft.com/office/word/2010/wordprocessingShape" mc:Ignorable="w14 w15 w16se w16cid w16 w16cex w16sdtdh wp14">
+  <w:footnote w:type="separator" w:id="-1">
+    <w:p>
+      <w:r>
+        <w:separator/>
+      </w:r>
+    </w:p>
+  </w:footnote>
+  <w:footnote w:type="continuationSeparator" w:id="0">
+    <w:p>
+      <w:r>
+        <w:continuationSeparator/>
+      </w:r>
+    </w:p>
+  </w:footnote>
+</w:footnotes>
+</file>
+
 <file path=word/styles.xml><?xml version="1.0" encoding="utf-8"?>
-<w:styles xmlns:w="http://schemas.openxmlformats.org/wordprocessingml/2006/main" xmlns:w14="http://schemas.microsoft.com/office/word/2010/wordml" xmlns:mc="http://schemas.openxmlformats.org/markup-compatibility/2006" mc:Ignorable="w14">
+<w:styles xmlns:mc="http://schemas.openxmlformats.org/markup-compatibility/2006" xmlns:r="http://schemas.openxmlformats.org/officeDocument/2006/relationships" xmlns:w="http://schemas.openxmlformats.org/wordprocessingml/2006/main" xmlns:w14="http://schemas.microsoft.com/office/word/2010/wordml" xmlns:w15="http://schemas.microsoft.com/office/word/2012/wordml" xmlns:w16cex="http://schemas.microsoft.com/office/word/2018/wordml/cex" xmlns:w16cid="http://schemas.microsoft.com/office/word/2016/wordml/cid" xmlns:w16="http://schemas.microsoft.com/office/word/2018/wordml" xmlns:w16sdtdh="http://schemas.microsoft.com/office/word/2020/wordml/sdtdatahash" xmlns:w16se="http://schemas.microsoft.com/office/word/2015/wordml/symex" mc:Ignorable="w14 w15 w16se w16cid w16 w16cex w16sdtdh">
   <w:docDefaults>
     <w:rPrDefault>
       <w:rPr>
-        <w:rFonts w:ascii="Calibri" w:hAnsi="Calibri" w:eastAsia="Calibri" w:cs="" w:asciiTheme="minorHAnsi" w:cstheme="minorBidi" w:eastAsiaTheme="minorHAnsi" w:hAnsiTheme="minorHAnsi"/>
+        <w:rFonts w:asciiTheme="minorHAnsi" w:eastAsiaTheme="minorHAnsi" w:hAnsiTheme="minorHAnsi" w:cstheme="minorBidi"/>
         <w:sz w:val="22"/>
         <w:szCs w:val="22"/>
         <w:lang w:val="ru-RU" w:eastAsia="en-US" w:bidi="ar-SA"/>
@@ -1910,21 +2430,21 @@
     </w:rPrDefault>
     <w:pPrDefault>
       <w:pPr>
-        <w:suppressAutoHyphens w:val="true"/>
+        <w:suppressAutoHyphens/>
       </w:pPr>
     </w:pPrDefault>
   </w:docDefaults>
   <w:latentStyles w:defLockedState="0" w:defUIPriority="99" w:defSemiHidden="0" w:defUnhideWhenUsed="0" w:defQFormat="0" w:count="376">
     <w:lsdException w:name="Normal" w:uiPriority="0" w:qFormat="1"/>
     <w:lsdException w:name="heading 1" w:uiPriority="9" w:qFormat="1"/>
-    <w:lsdException w:name="heading 2" w:uiPriority="9" w:semiHidden="1" w:unhideWhenUsed="1" w:qFormat="1"/>
-    <w:lsdException w:name="heading 3" w:uiPriority="9" w:semiHidden="1" w:unhideWhenUsed="1" w:qFormat="1"/>
-    <w:lsdException w:name="heading 4" w:uiPriority="9" w:semiHidden="1" w:unhideWhenUsed="1" w:qFormat="1"/>
-    <w:lsdException w:name="heading 5" w:uiPriority="9" w:semiHidden="1" w:unhideWhenUsed="1" w:qFormat="1"/>
-    <w:lsdException w:name="heading 6" w:uiPriority="9" w:semiHidden="1" w:unhideWhenUsed="1" w:qFormat="1"/>
-    <w:lsdException w:name="heading 7" w:uiPriority="9" w:semiHidden="1" w:unhideWhenUsed="1" w:qFormat="1"/>
-    <w:lsdException w:name="heading 8" w:uiPriority="9" w:semiHidden="1" w:unhideWhenUsed="1" w:qFormat="1"/>
-    <w:lsdException w:name="heading 9" w:uiPriority="9" w:semiHidden="1" w:unhideWhenUsed="1" w:qFormat="1"/>
+    <w:lsdException w:name="heading 2" w:semiHidden="1" w:uiPriority="9" w:unhideWhenUsed="1" w:qFormat="1"/>
+    <w:lsdException w:name="heading 3" w:semiHidden="1" w:uiPriority="9" w:unhideWhenUsed="1" w:qFormat="1"/>
+    <w:lsdException w:name="heading 4" w:semiHidden="1" w:uiPriority="9" w:unhideWhenUsed="1" w:qFormat="1"/>
+    <w:lsdException w:name="heading 5" w:semiHidden="1" w:uiPriority="9" w:unhideWhenUsed="1" w:qFormat="1"/>
+    <w:lsdException w:name="heading 6" w:semiHidden="1" w:uiPriority="9" w:unhideWhenUsed="1" w:qFormat="1"/>
+    <w:lsdException w:name="heading 7" w:semiHidden="1" w:uiPriority="9" w:unhideWhenUsed="1" w:qFormat="1"/>
+    <w:lsdException w:name="heading 8" w:semiHidden="1" w:uiPriority="9" w:unhideWhenUsed="1" w:qFormat="1"/>
+    <w:lsdException w:name="heading 9" w:semiHidden="1" w:uiPriority="9" w:unhideWhenUsed="1" w:qFormat="1"/>
     <w:lsdException w:name="index 1" w:semiHidden="1" w:unhideWhenUsed="1"/>
     <w:lsdException w:name="index 2" w:semiHidden="1" w:unhideWhenUsed="1"/>
     <w:lsdException w:name="index 3" w:semiHidden="1" w:unhideWhenUsed="1"/>
@@ -1934,22 +2454,22 @@
     <w:lsdException w:name="index 7" w:semiHidden="1" w:unhideWhenUsed="1"/>
     <w:lsdException w:name="index 8" w:semiHidden="1" w:unhideWhenUsed="1"/>
     <w:lsdException w:name="index 9" w:semiHidden="1" w:unhideWhenUsed="1"/>
-    <w:lsdException w:name="toc 1" w:uiPriority="39" w:semiHidden="1" w:unhideWhenUsed="1"/>
-    <w:lsdException w:name="toc 2" w:uiPriority="39" w:semiHidden="1" w:unhideWhenUsed="1"/>
-    <w:lsdException w:name="toc 3" w:uiPriority="39" w:semiHidden="1" w:unhideWhenUsed="1"/>
-    <w:lsdException w:name="toc 4" w:uiPriority="39" w:semiHidden="1" w:unhideWhenUsed="1"/>
-    <w:lsdException w:name="toc 5" w:uiPriority="39" w:semiHidden="1" w:unhideWhenUsed="1"/>
-    <w:lsdException w:name="toc 6" w:uiPriority="39" w:semiHidden="1" w:unhideWhenUsed="1"/>
-    <w:lsdException w:name="toc 7" w:uiPriority="39" w:semiHidden="1" w:unhideWhenUsed="1"/>
-    <w:lsdException w:name="toc 8" w:uiPriority="39" w:semiHidden="1" w:unhideWhenUsed="1"/>
-    <w:lsdException w:name="toc 9" w:uiPriority="39" w:semiHidden="1" w:unhideWhenUsed="1"/>
+    <w:lsdException w:name="toc 1" w:semiHidden="1" w:uiPriority="39" w:unhideWhenUsed="1"/>
+    <w:lsdException w:name="toc 2" w:semiHidden="1" w:uiPriority="39" w:unhideWhenUsed="1"/>
+    <w:lsdException w:name="toc 3" w:semiHidden="1" w:uiPriority="39" w:unhideWhenUsed="1"/>
+    <w:lsdException w:name="toc 4" w:semiHidden="1" w:uiPriority="39" w:unhideWhenUsed="1"/>
+    <w:lsdException w:name="toc 5" w:semiHidden="1" w:uiPriority="39" w:unhideWhenUsed="1"/>
+    <w:lsdException w:name="toc 6" w:semiHidden="1" w:uiPriority="39" w:unhideWhenUsed="1"/>
+    <w:lsdException w:name="toc 7" w:semiHidden="1" w:uiPriority="39" w:unhideWhenUsed="1"/>
+    <w:lsdException w:name="toc 8" w:semiHidden="1" w:uiPriority="39" w:unhideWhenUsed="1"/>
+    <w:lsdException w:name="toc 9" w:semiHidden="1" w:uiPriority="39" w:unhideWhenUsed="1"/>
     <w:lsdException w:name="Normal Indent" w:semiHidden="1" w:unhideWhenUsed="1"/>
     <w:lsdException w:name="footnote text" w:semiHidden="1" w:unhideWhenUsed="1"/>
     <w:lsdException w:name="annotation text" w:semiHidden="1" w:unhideWhenUsed="1"/>
     <w:lsdException w:name="header" w:semiHidden="1" w:unhideWhenUsed="1"/>
     <w:lsdException w:name="footer" w:semiHidden="1" w:unhideWhenUsed="1"/>
     <w:lsdException w:name="index heading" w:semiHidden="1" w:unhideWhenUsed="1"/>
-    <w:lsdException w:name="caption" w:uiPriority="35" w:semiHidden="1" w:unhideWhenUsed="1" w:qFormat="1"/>
+    <w:lsdException w:name="caption" w:semiHidden="1" w:uiPriority="35" w:unhideWhenUsed="1" w:qFormat="1"/>
     <w:lsdException w:name="table of figures" w:semiHidden="1" w:unhideWhenUsed="1"/>
     <w:lsdException w:name="envelope address" w:semiHidden="1" w:unhideWhenUsed="1"/>
     <w:lsdException w:name="envelope return" w:semiHidden="1" w:unhideWhenUsed="1"/>
@@ -1980,7 +2500,7 @@
     <w:lsdException w:name="Title" w:uiPriority="10" w:qFormat="1"/>
     <w:lsdException w:name="Closing" w:semiHidden="1" w:unhideWhenUsed="1"/>
     <w:lsdException w:name="Signature" w:semiHidden="1" w:unhideWhenUsed="1"/>
-    <w:lsdException w:name="Default Paragraph Font" w:uiPriority="1" w:semiHidden="1" w:unhideWhenUsed="1"/>
+    <w:lsdException w:name="Default Paragraph Font" w:semiHidden="1" w:uiPriority="1" w:unhideWhenUsed="1"/>
     <w:lsdException w:name="Body Text" w:semiHidden="1" w:unhideWhenUsed="1"/>
     <w:lsdException w:name="Body Text Indent" w:semiHidden="1" w:unhideWhenUsed="1"/>
     <w:lsdException w:name="List Continue" w:semiHidden="1" w:unhideWhenUsed="1"/>
@@ -2005,7 +2525,7 @@
     <w:lsdException w:name="Strong" w:uiPriority="22" w:qFormat="1"/>
     <w:lsdException w:name="Emphasis" w:uiPriority="20" w:qFormat="1"/>
     <w:lsdException w:name="Document Map" w:semiHidden="1" w:unhideWhenUsed="1"/>
-    <w:lsdException w:name="Plain Text" w:uiPriority="0" w:semiHidden="1" w:unhideWhenUsed="1"/>
+    <w:lsdException w:name="Plain Text" w:semiHidden="1" w:uiPriority="0" w:unhideWhenUsed="1"/>
     <w:lsdException w:name="E-mail Signature" w:semiHidden="1" w:unhideWhenUsed="1"/>
     <w:lsdException w:name="HTML Top of Form" w:semiHidden="1" w:unhideWhenUsed="1"/>
     <w:lsdException w:name="HTML Bottom of Form" w:semiHidden="1" w:unhideWhenUsed="1"/>
@@ -2180,8 +2700,8 @@
     <w:lsdException w:name="Subtle Reference" w:uiPriority="31" w:qFormat="1"/>
     <w:lsdException w:name="Intense Reference" w:uiPriority="32" w:qFormat="1"/>
     <w:lsdException w:name="Book Title" w:uiPriority="33" w:qFormat="1"/>
-    <w:lsdException w:name="Bibliography" w:uiPriority="37" w:semiHidden="1" w:unhideWhenUsed="1"/>
-    <w:lsdException w:name="TOC Heading" w:uiPriority="39" w:semiHidden="1" w:unhideWhenUsed="1" w:qFormat="1"/>
+    <w:lsdException w:name="Bibliography" w:semiHidden="1" w:uiPriority="37" w:unhideWhenUsed="1"/>
+    <w:lsdException w:name="TOC Heading" w:semiHidden="1" w:uiPriority="39" w:unhideWhenUsed="1" w:qFormat="1"/>
     <w:lsdException w:name="Plain Table 1" w:uiPriority="41"/>
     <w:lsdException w:name="Plain Table 2" w:uiPriority="42"/>
     <w:lsdException w:name="Plain Table 3" w:uiPriority="43"/>
@@ -2292,154 +2812,166 @@
     <w:lsdException w:name="Unresolved Mention" w:semiHidden="1" w:unhideWhenUsed="1"/>
     <w:lsdException w:name="Smart Link" w:semiHidden="1" w:unhideWhenUsed="1"/>
   </w:latentStyles>
-  <w:style w:type="paragraph" w:styleId="Normal" w:default="1">
+  <w:style w:type="paragraph" w:default="1" w:styleId="a">
     <w:name w:val="Normal"/>
     <w:qFormat/>
-    <w:rsid w:val="00f24e5e"/>
+    <w:rsid w:val="00F24E5E"/>
     <w:pPr>
-      <w:widowControl w:val="false"/>
-      <w:suppressAutoHyphens w:val="true"/>
-      <w:bidi w:val="0"/>
-      <w:spacing w:before="0" w:after="0"/>
-      <w:jc w:val="left"/>
+      <w:widowControl w:val="0"/>
     </w:pPr>
     <w:rPr>
-      <w:rFonts w:ascii="Times New Roman" w:hAnsi="Times New Roman" w:eastAsia="Times New Roman" w:cs="Times New Roman"/>
+      <w:rFonts w:ascii="Times New Roman" w:eastAsia="Times New Roman" w:hAnsi="Times New Roman" w:cs="Times New Roman"/>
       <w:color w:val="000000"/>
-      <w:kern w:val="0"/>
-      <w:sz w:val="22"/>
       <w:szCs w:val="20"/>
-      <w:lang w:val="ru-RU" w:eastAsia="ru-RU" w:bidi="ar-SA"/>
+      <w:lang w:eastAsia="ru-RU"/>
     </w:rPr>
   </w:style>
-  <w:style w:type="character" w:styleId="DefaultParagraphFont" w:default="1">
+  <w:style w:type="character" w:default="1" w:styleId="a0">
     <w:name w:val="Default Paragraph Font"/>
     <w:uiPriority w:val="1"/>
+    <w:semiHidden/>
     <w:unhideWhenUsed/>
-    <w:qFormat/>
-    <w:rPr/>
   </w:style>
-  <w:style w:type="character" w:styleId="Style14" w:customStyle="1">
+  <w:style w:type="table" w:default="1" w:styleId="a1">
+    <w:name w:val="Normal Table"/>
+    <w:uiPriority w:val="99"/>
+    <w:semiHidden/>
+    <w:unhideWhenUsed/>
+    <w:tblPr>
+      <w:tblInd w:w="0" w:type="dxa"/>
+      <w:tblCellMar>
+        <w:top w:w="0" w:type="dxa"/>
+        <w:left w:w="108" w:type="dxa"/>
+        <w:bottom w:w="0" w:type="dxa"/>
+        <w:right w:w="108" w:type="dxa"/>
+      </w:tblCellMar>
+    </w:tblPr>
+  </w:style>
+  <w:style w:type="numbering" w:default="1" w:styleId="a2">
+    <w:name w:val="No List"/>
+    <w:uiPriority w:val="99"/>
+    <w:semiHidden/>
+    <w:unhideWhenUsed/>
+  </w:style>
+  <w:style w:type="character" w:customStyle="1" w:styleId="a3">
     <w:name w:val="Текст Знак"/>
-    <w:basedOn w:val="DefaultParagraphFont"/>
-    <w:link w:val="PlainText"/>
+    <w:basedOn w:val="a0"/>
+    <w:link w:val="a4"/>
     <w:semiHidden/>
     <w:qFormat/>
-    <w:rsid w:val="000a29dc"/>
+    <w:rsid w:val="000A29DC"/>
     <w:rPr>
-      <w:rFonts w:ascii="Courier New" w:hAnsi="Courier New" w:eastAsia="Times New Roman" w:cs="Times New Roman"/>
+      <w:rFonts w:ascii="Courier New" w:eastAsia="Times New Roman" w:hAnsi="Courier New" w:cs="Times New Roman"/>
       <w:sz w:val="20"/>
       <w:szCs w:val="24"/>
       <w:lang w:eastAsia="ru-RU"/>
     </w:rPr>
   </w:style>
-  <w:style w:type="character" w:styleId="Style15" w:customStyle="1">
+  <w:style w:type="character" w:customStyle="1" w:styleId="a5">
     <w:name w:val="Абзац списка Знак"/>
-    <w:basedOn w:val="DefaultParagraphFont"/>
-    <w:link w:val="ListParagraph"/>
+    <w:basedOn w:val="a0"/>
+    <w:link w:val="a6"/>
     <w:uiPriority w:val="34"/>
     <w:qFormat/>
     <w:locked/>
-    <w:rsid w:val="000a29dc"/>
+    <w:rsid w:val="000A29DC"/>
     <w:rPr>
-      <w:rFonts w:ascii="Times New Roman" w:hAnsi="Times New Roman" w:eastAsia="Times New Roman" w:cs="Times New Roman"/>
+      <w:rFonts w:ascii="Times New Roman" w:eastAsia="Times New Roman" w:hAnsi="Times New Roman" w:cs="Times New Roman"/>
       <w:color w:val="000000"/>
       <w:szCs w:val="20"/>
       <w:lang w:eastAsia="ru-RU"/>
     </w:rPr>
   </w:style>
-  <w:style w:type="character" w:styleId="Style16" w:customStyle="1">
+  <w:style w:type="character" w:customStyle="1" w:styleId="a7">
     <w:name w:val="Код Знак"/>
-    <w:basedOn w:val="Style15"/>
-    <w:link w:val="Style20"/>
+    <w:basedOn w:val="a5"/>
+    <w:link w:val="a8"/>
     <w:qFormat/>
     <w:locked/>
-    <w:rsid w:val="000a29dc"/>
+    <w:rsid w:val="000A29DC"/>
     <w:rPr>
-      <w:rFonts w:ascii="Courier New" w:hAnsi="Courier New" w:eastAsia="Times New Roman" w:cs="Courier New"/>
-      <w:color w:themeColor="text1" w:val="000000"/>
+      <w:rFonts w:ascii="Courier New" w:eastAsia="Times New Roman" w:hAnsi="Courier New" w:cs="Courier New"/>
+      <w:color w:val="000000" w:themeColor="text1"/>
       <w:sz w:val="20"/>
       <w:szCs w:val="20"/>
       <w:lang w:val="en-US" w:eastAsia="ru-RU"/>
     </w:rPr>
   </w:style>
-  <w:style w:type="character" w:styleId="Style17" w:customStyle="1">
+  <w:style w:type="character" w:customStyle="1" w:styleId="a9">
     <w:name w:val="База Знак"/>
-    <w:basedOn w:val="DefaultParagraphFont"/>
-    <w:link w:val="Style21"/>
+    <w:basedOn w:val="a0"/>
+    <w:link w:val="aa"/>
     <w:qFormat/>
     <w:locked/>
-    <w:rsid w:val="000a29dc"/>
+    <w:rsid w:val="000A29DC"/>
     <w:rPr>
-      <w:rFonts w:ascii="Times New Roman" w:hAnsi="Times New Roman" w:eastAsia="Times New Roman" w:cs="Times New Roman"/>
+      <w:rFonts w:ascii="Times New Roman" w:eastAsia="Times New Roman" w:hAnsi="Times New Roman" w:cs="Times New Roman"/>
       <w:color w:val="000000"/>
       <w:sz w:val="28"/>
       <w:szCs w:val="20"/>
       <w:lang w:eastAsia="ru-RU"/>
     </w:rPr>
   </w:style>
-  <w:style w:type="character" w:styleId="Style18" w:customStyle="1">
+  <w:style w:type="character" w:customStyle="1" w:styleId="ab">
     <w:name w:val="Верхний колонтитул Знак"/>
-    <w:basedOn w:val="DefaultParagraphFont"/>
-    <w:link w:val="Header"/>
+    <w:basedOn w:val="a0"/>
+    <w:link w:val="ac"/>
     <w:uiPriority w:val="99"/>
     <w:qFormat/>
-    <w:rsid w:val="001b1469"/>
+    <w:rsid w:val="001B1469"/>
     <w:rPr>
-      <w:rFonts w:ascii="Times New Roman" w:hAnsi="Times New Roman" w:eastAsia="Times New Roman" w:cs="Times New Roman"/>
+      <w:rFonts w:ascii="Times New Roman" w:eastAsia="Times New Roman" w:hAnsi="Times New Roman" w:cs="Times New Roman"/>
       <w:color w:val="000000"/>
       <w:szCs w:val="20"/>
       <w:lang w:eastAsia="ru-RU"/>
     </w:rPr>
   </w:style>
-  <w:style w:type="character" w:styleId="Style19" w:customStyle="1">
+  <w:style w:type="character" w:customStyle="1" w:styleId="ad">
     <w:name w:val="Нижний колонтитул Знак"/>
-    <w:basedOn w:val="DefaultParagraphFont"/>
-    <w:link w:val="Footer"/>
+    <w:basedOn w:val="a0"/>
+    <w:link w:val="ae"/>
     <w:uiPriority w:val="99"/>
     <w:qFormat/>
-    <w:rsid w:val="001b1469"/>
+    <w:rsid w:val="001B1469"/>
     <w:rPr>
-      <w:rFonts w:ascii="Times New Roman" w:hAnsi="Times New Roman" w:eastAsia="Times New Roman" w:cs="Times New Roman"/>
+      <w:rFonts w:ascii="Times New Roman" w:eastAsia="Times New Roman" w:hAnsi="Times New Roman" w:cs="Times New Roman"/>
       <w:color w:val="000000"/>
       <w:szCs w:val="20"/>
       <w:lang w:eastAsia="ru-RU"/>
     </w:rPr>
   </w:style>
-  <w:style w:type="paragraph" w:styleId="Heading" w:customStyle="1">
+  <w:style w:type="paragraph" w:customStyle="1" w:styleId="Heading">
     <w:name w:val="Heading"/>
-    <w:basedOn w:val="Normal"/>
-    <w:next w:val="BodyText"/>
+    <w:basedOn w:val="a"/>
+    <w:next w:val="af"/>
     <w:qFormat/>
     <w:pPr>
-      <w:keepNext w:val="true"/>
+      <w:keepNext/>
       <w:spacing w:before="240" w:after="120"/>
     </w:pPr>
     <w:rPr>
-      <w:rFonts w:ascii="Liberation Sans" w:hAnsi="Liberation Sans" w:eastAsia="Noto Sans CJK SC" w:cs="Noto Sans Devanagari"/>
+      <w:rFonts w:ascii="Liberation Sans" w:eastAsia="Noto Sans CJK SC" w:hAnsi="Liberation Sans" w:cs="Noto Sans Devanagari"/>
       <w:sz w:val="28"/>
       <w:szCs w:val="28"/>
     </w:rPr>
   </w:style>
-  <w:style w:type="paragraph" w:styleId="BodyText">
+  <w:style w:type="paragraph" w:styleId="af">
     <w:name w:val="Body Text"/>
-    <w:basedOn w:val="Normal"/>
+    <w:basedOn w:val="a"/>
     <w:pPr>
-      <w:spacing w:lineRule="auto" w:line="276" w:before="0" w:after="140"/>
+      <w:spacing w:after="140" w:line="276" w:lineRule="auto"/>
     </w:pPr>
-    <w:rPr/>
   </w:style>
-  <w:style w:type="paragraph" w:styleId="List">
+  <w:style w:type="paragraph" w:styleId="af0">
     <w:name w:val="List"/>
-    <w:basedOn w:val="BodyText"/>
-    <w:pPr/>
+    <w:basedOn w:val="af"/>
     <w:rPr>
       <w:rFonts w:cs="Noto Sans Devanagari"/>
     </w:rPr>
   </w:style>
-  <w:style w:type="paragraph" w:styleId="Caption">
-    <w:name w:val="Caption"/>
-    <w:basedOn w:val="Normal"/>
+  <w:style w:type="paragraph" w:styleId="af1">
+    <w:name w:val="caption"/>
+    <w:basedOn w:val="a"/>
     <w:qFormat/>
     <w:pPr>
       <w:suppressLineNumbers/>
@@ -2453,9 +2985,9 @@
       <w:szCs w:val="24"/>
     </w:rPr>
   </w:style>
-  <w:style w:type="paragraph" w:styleId="Index" w:customStyle="1">
+  <w:style w:type="paragraph" w:customStyle="1" w:styleId="Index">
     <w:name w:val="Index"/>
-    <w:basedOn w:val="Normal"/>
+    <w:basedOn w:val="a"/>
     <w:qFormat/>
     <w:pPr>
       <w:suppressLineNumbers/>
@@ -2464,14 +2996,14 @@
       <w:rFonts w:cs="Noto Sans Devanagari"/>
     </w:rPr>
   </w:style>
-  <w:style w:type="paragraph" w:styleId="PlainText">
+  <w:style w:type="paragraph" w:styleId="a4">
     <w:name w:val="Plain Text"/>
-    <w:basedOn w:val="Normal"/>
-    <w:link w:val="Style14"/>
+    <w:basedOn w:val="a"/>
+    <w:link w:val="a3"/>
     <w:semiHidden/>
     <w:unhideWhenUsed/>
     <w:qFormat/>
-    <w:rsid w:val="000a29dc"/>
+    <w:rsid w:val="000A29DC"/>
     <w:pPr>
       <w:widowControl/>
     </w:pPr>
@@ -2482,163 +3014,134 @@
       <w:szCs w:val="24"/>
     </w:rPr>
   </w:style>
-  <w:style w:type="paragraph" w:styleId="ListParagraph">
+  <w:style w:type="paragraph" w:styleId="a6">
     <w:name w:val="List Paragraph"/>
-    <w:basedOn w:val="Normal"/>
-    <w:link w:val="Style15"/>
+    <w:basedOn w:val="a"/>
+    <w:link w:val="a5"/>
     <w:uiPriority w:val="34"/>
     <w:qFormat/>
-    <w:rsid w:val="000a29dc"/>
+    <w:rsid w:val="000A29DC"/>
     <w:pPr>
-      <w:spacing w:before="0" w:after="0"/>
       <w:ind w:left="720"/>
       <w:contextualSpacing/>
     </w:pPr>
-    <w:rPr/>
   </w:style>
-  <w:style w:type="paragraph" w:styleId="Style20" w:customStyle="1">
+  <w:style w:type="paragraph" w:customStyle="1" w:styleId="a8">
     <w:name w:val="Код"/>
-    <w:basedOn w:val="ListParagraph"/>
-    <w:link w:val="Style16"/>
+    <w:basedOn w:val="a6"/>
+    <w:link w:val="a7"/>
     <w:qFormat/>
-    <w:rsid w:val="000a29dc"/>
+    <w:rsid w:val="000A29DC"/>
     <w:pPr>
-      <w:spacing w:lineRule="auto" w:line="276"/>
+      <w:spacing w:line="276" w:lineRule="auto"/>
       <w:ind w:left="0"/>
     </w:pPr>
     <w:rPr>
       <w:rFonts w:ascii="Courier New" w:hAnsi="Courier New" w:cs="Courier New"/>
-      <w:color w:themeColor="text1" w:val="000000"/>
+      <w:color w:val="000000" w:themeColor="text1"/>
       <w:sz w:val="20"/>
       <w:lang w:val="en-US"/>
     </w:rPr>
   </w:style>
-  <w:style w:type="paragraph" w:styleId="Style21" w:customStyle="1">
+  <w:style w:type="paragraph" w:customStyle="1" w:styleId="aa">
     <w:name w:val="База"/>
-    <w:basedOn w:val="Normal"/>
-    <w:link w:val="Style17"/>
+    <w:basedOn w:val="a"/>
+    <w:link w:val="a9"/>
     <w:qFormat/>
-    <w:rsid w:val="000a29dc"/>
+    <w:rsid w:val="000A29DC"/>
     <w:pPr>
-      <w:spacing w:lineRule="auto" w:line="360"/>
+      <w:spacing w:line="360" w:lineRule="auto"/>
       <w:ind w:firstLine="709"/>
     </w:pPr>
     <w:rPr>
       <w:sz w:val="28"/>
     </w:rPr>
   </w:style>
-  <w:style w:type="paragraph" w:styleId="HeaderandFooter" w:customStyle="1">
+  <w:style w:type="paragraph" w:customStyle="1" w:styleId="HeaderandFooter">
     <w:name w:val="Header and Footer"/>
-    <w:basedOn w:val="Normal"/>
+    <w:basedOn w:val="a"/>
     <w:qFormat/>
-    <w:pPr/>
-    <w:rPr/>
   </w:style>
-  <w:style w:type="paragraph" w:styleId="Header">
-    <w:name w:val="Header"/>
-    <w:basedOn w:val="Normal"/>
-    <w:link w:val="Style18"/>
+  <w:style w:type="paragraph" w:styleId="ac">
+    <w:name w:val="header"/>
+    <w:basedOn w:val="a"/>
+    <w:link w:val="ab"/>
     <w:uiPriority w:val="99"/>
     <w:unhideWhenUsed/>
-    <w:rsid w:val="001b1469"/>
+    <w:rsid w:val="001B1469"/>
     <w:pPr>
       <w:tabs>
-        <w:tab w:val="clear" w:pos="708"/>
-        <w:tab w:val="center" w:pos="4677" w:leader="none"/>
-        <w:tab w:val="right" w:pos="9355" w:leader="none"/>
+        <w:tab w:val="center" w:pos="4677"/>
+        <w:tab w:val="right" w:pos="9355"/>
       </w:tabs>
     </w:pPr>
-    <w:rPr/>
   </w:style>
-  <w:style w:type="paragraph" w:styleId="Footer">
-    <w:name w:val="Footer"/>
-    <w:basedOn w:val="Normal"/>
-    <w:link w:val="Style19"/>
+  <w:style w:type="paragraph" w:styleId="ae">
+    <w:name w:val="footer"/>
+    <w:basedOn w:val="a"/>
+    <w:link w:val="ad"/>
     <w:uiPriority w:val="99"/>
     <w:unhideWhenUsed/>
-    <w:rsid w:val="001b1469"/>
+    <w:rsid w:val="001B1469"/>
     <w:pPr>
       <w:tabs>
-        <w:tab w:val="clear" w:pos="708"/>
-        <w:tab w:val="center" w:pos="4677" w:leader="none"/>
-        <w:tab w:val="right" w:pos="9355" w:leader="none"/>
+        <w:tab w:val="center" w:pos="4677"/>
+        <w:tab w:val="right" w:pos="9355"/>
       </w:tabs>
     </w:pPr>
-    <w:rPr/>
-  </w:style>
-  <w:style w:type="numbering" w:styleId="NoList" w:default="1">
-    <w:name w:val="No List"/>
-    <w:uiPriority w:val="99"/>
-    <w:semiHidden/>
-    <w:unhideWhenUsed/>
-    <w:qFormat/>
-  </w:style>
-  <w:style w:type="table" w:default="1" w:styleId="a1">
-    <w:name w:val="Normal Table"/>
-    <w:uiPriority w:val="99"/>
-    <w:semiHidden/>
-    <w:unhideWhenUsed/>
-    <w:tblPr>
-      <w:tblCellMar>
-        <w:top w:w="0" w:type="dxa"/>
-        <w:left w:w="108" w:type="dxa"/>
-        <w:bottom w:w="0" w:type="dxa"/>
-        <w:right w:w="108" w:type="dxa"/>
-      </w:tblCellMar>
-    </w:tblPr>
   </w:style>
 </w:styles>
 </file>
 
 <file path=word/theme/theme1.xml><?xml version="1.0" encoding="utf-8"?>
-<a:theme xmlns:a="http://schemas.openxmlformats.org/drawingml/2006/main" xmlns:r="http://schemas.openxmlformats.org/officeDocument/2006/relationships" name="Тема Office">
+<a:theme xmlns:a="http://schemas.openxmlformats.org/drawingml/2006/main" name="Тема Office">
   <a:themeElements>
     <a:clrScheme name="Стандартная">
       <a:dk1>
         <a:srgbClr val="000000"/>
       </a:dk1>
       <a:lt1>
-        <a:srgbClr val="ffffff"/>
+        <a:srgbClr val="FFFFFF"/>
       </a:lt1>
       <a:dk2>
-        <a:srgbClr val="44546a"/>
+        <a:srgbClr val="44546A"/>
       </a:dk2>
       <a:lt2>
-        <a:srgbClr val="e7e6e6"/>
+        <a:srgbClr val="E7E6E6"/>
       </a:lt2>
       <a:accent1>
-        <a:srgbClr val="4472c4"/>
+        <a:srgbClr val="4472C4"/>
       </a:accent1>
       <a:accent2>
-        <a:srgbClr val="ed7d31"/>
+        <a:srgbClr val="ED7D31"/>
       </a:accent2>
       <a:accent3>
-        <a:srgbClr val="a5a5a5"/>
+        <a:srgbClr val="A5A5A5"/>
       </a:accent3>
       <a:accent4>
-        <a:srgbClr val="ffc000"/>
+        <a:srgbClr val="FFC000"/>
       </a:accent4>
       <a:accent5>
-        <a:srgbClr val="5b9bd5"/>
+        <a:srgbClr val="5B9BD5"/>
       </a:accent5>
       <a:accent6>
-        <a:srgbClr val="70ad47"/>
+        <a:srgbClr val="70AD47"/>
       </a:accent6>
       <a:hlink>
-        <a:srgbClr val="0563c1"/>
+        <a:srgbClr val="0563C1"/>
       </a:hlink>
       <a:folHlink>
-        <a:srgbClr val="954f72"/>
+        <a:srgbClr val="954F72"/>
       </a:folHlink>
     </a:clrScheme>
     <a:fontScheme name="Стандартная">
       <a:majorFont>
-        <a:latin typeface="Calibri Light" panose="020F0302020204030204" pitchFamily="0" charset="1"/>
+        <a:latin typeface="Calibri Light" panose="020F0302020204030204"/>
         <a:ea typeface=""/>
         <a:cs typeface=""/>
       </a:majorFont>
       <a:minorFont>
-        <a:latin typeface="Calibri" panose="020F0502020204030204" pitchFamily="0" charset="1"/>
+        <a:latin typeface="Calibri" panose="020F0502020204030204"/>
         <a:ea typeface=""/>
         <a:cs typeface=""/>
       </a:minorFont>
@@ -2670,7 +3173,7 @@
             </a:gs>
           </a:gsLst>
           <a:lin ang="5400000" scaled="0"/>
-          <a:tileRect l="0" t="0" r="0" b="0"/>
+          <a:tileRect/>
         </a:gradFill>
         <a:gradFill>
           <a:gsLst>
@@ -2694,7 +3197,7 @@
             </a:gs>
           </a:gsLst>
           <a:lin ang="5400000" scaled="0"/>
-          <a:tileRect l="0" t="0" r="0" b="0"/>
+          <a:tileRect/>
         </a:gradFill>
       </a:fillStyleLst>
       <a:lnStyleLst>
@@ -2754,10 +3257,12 @@
             </a:gs>
           </a:gsLst>
           <a:lin ang="5400000" scaled="0"/>
-          <a:tileRect l="0" t="0" r="0" b="0"/>
+          <a:tileRect/>
         </a:gradFill>
       </a:bgFillStyleLst>
     </a:fmtScheme>
   </a:themeElements>
+  <a:objectDefaults/>
+  <a:extraClrSchemeLst/>
 </a:theme>
 </file>
</xml_diff>